<commit_message>
Record the four team members on the cover and contribution statement.
Names, initials, student numbers, and emails are written into the report and the submission package. Contribution categories stay unconfirmed, and every signature and date cell stays blank.

Co-authored-by: Thabang Mokoena <MokoenaThabang@users.noreply.github.com>
</commit_message>
<xml_diff>
--- a/submission_package/Documentation/Contribution_Statement.docx
+++ b/submission_package/Documentation/Contribution_Statement.docx
@@ -18,9 +18,602 @@
           <w:i w:val="0"/>
           <w:sz w:val="22"/>
         </w:rPr>
-        <w:t>IDA117V group project. One page for the members to complete. This page lists the work that is actually in the repository. It does not assign that work to a person. No signature below is a signature. No row claims that a presentation was attended or that a defence was marked.</w:t>
+        <w:t>IDA117V group project. This page names the four members and lists the work that is in the repository. It does not assign that work to a person except for the git record stated below. No signature below is a signature. No row claims that a presentation was attended or that a defence was marked. A blank signature cell is unsigned. Typed initials are not entered in any signature cell.</w:t>
       </w:r>
     </w:p>
+    <w:p>
+      <w:pPr>
+        <w:pStyle w:val="Heading2"/>
+      </w:pPr>
+      <w:r>
+        <w:t>Team</w:t>
+      </w:r>
+    </w:p>
+    <w:tbl>
+      <w:tblPr>
+        <w:tblStyle w:val="TableGrid"/>
+        <w:tblW w:type="auto" w:w="0"/>
+        <w:tblLayout w:type="autofit"/>
+        <w:tblLook w:firstColumn="1" w:firstRow="1" w:lastColumn="0" w:lastRow="0" w:noHBand="0" w:noVBand="1" w:val="04A0"/>
+      </w:tblPr>
+      <w:tblGrid>
+        <w:gridCol w:w="1569"/>
+        <w:gridCol w:w="1569"/>
+        <w:gridCol w:w="1569"/>
+        <w:gridCol w:w="1569"/>
+        <w:gridCol w:w="1569"/>
+        <w:gridCol w:w="1569"/>
+      </w:tblGrid>
+      <w:tr>
+        <w:tc>
+          <w:tcPr>
+            <w:tcW w:type="dxa" w:w="1569"/>
+            <w:shd w:fill="E6EEF2" w:val="clear"/>
+          </w:tcPr>
+          <w:p>
+            <w:pPr>
+              <w:spacing w:after="40" w:before="40"/>
+            </w:pPr>
+            <w:r>
+              <w:rPr>
+                <w:b/>
+              </w:rPr>
+            </w:r>
+            <w:r>
+              <w:rPr>
+                <w:rFonts w:ascii="Calibri" w:hAnsi="Calibri" w:eastAsia="Calibri"/>
+                <w:b/>
+                <w:i w:val="0"/>
+                <w:sz w:val="18"/>
+              </w:rPr>
+              <w:t>Printed name</w:t>
+            </w:r>
+          </w:p>
+        </w:tc>
+        <w:tc>
+          <w:tcPr>
+            <w:tcW w:type="dxa" w:w="1569"/>
+            <w:shd w:fill="E6EEF2" w:val="clear"/>
+          </w:tcPr>
+          <w:p>
+            <w:pPr>
+              <w:spacing w:after="40" w:before="40"/>
+            </w:pPr>
+            <w:r>
+              <w:rPr>
+                <w:b/>
+              </w:rPr>
+            </w:r>
+            <w:r>
+              <w:rPr>
+                <w:rFonts w:ascii="Calibri" w:hAnsi="Calibri" w:eastAsia="Calibri"/>
+                <w:b/>
+                <w:i w:val="0"/>
+                <w:sz w:val="18"/>
+              </w:rPr>
+              <w:t>Initials</w:t>
+            </w:r>
+          </w:p>
+        </w:tc>
+        <w:tc>
+          <w:tcPr>
+            <w:tcW w:type="dxa" w:w="1569"/>
+            <w:shd w:fill="E6EEF2" w:val="clear"/>
+          </w:tcPr>
+          <w:p>
+            <w:pPr>
+              <w:spacing w:after="40" w:before="40"/>
+            </w:pPr>
+            <w:r>
+              <w:rPr>
+                <w:b/>
+              </w:rPr>
+            </w:r>
+            <w:r>
+              <w:rPr>
+                <w:rFonts w:ascii="Calibri" w:hAnsi="Calibri" w:eastAsia="Calibri"/>
+                <w:b/>
+                <w:i w:val="0"/>
+                <w:sz w:val="18"/>
+              </w:rPr>
+              <w:t>Student number</w:t>
+            </w:r>
+          </w:p>
+        </w:tc>
+        <w:tc>
+          <w:tcPr>
+            <w:tcW w:type="dxa" w:w="1569"/>
+            <w:shd w:fill="E6EEF2" w:val="clear"/>
+          </w:tcPr>
+          <w:p>
+            <w:pPr>
+              <w:spacing w:after="40" w:before="40"/>
+            </w:pPr>
+            <w:r>
+              <w:rPr>
+                <w:b/>
+              </w:rPr>
+            </w:r>
+            <w:r>
+              <w:rPr>
+                <w:rFonts w:ascii="Calibri" w:hAnsi="Calibri" w:eastAsia="Calibri"/>
+                <w:b/>
+                <w:i w:val="0"/>
+                <w:sz w:val="18"/>
+              </w:rPr>
+              <w:t>Email</w:t>
+            </w:r>
+          </w:p>
+        </w:tc>
+        <w:tc>
+          <w:tcPr>
+            <w:tcW w:type="dxa" w:w="1569"/>
+            <w:shd w:fill="E6EEF2" w:val="clear"/>
+          </w:tcPr>
+          <w:p>
+            <w:pPr>
+              <w:spacing w:after="40" w:before="40"/>
+            </w:pPr>
+            <w:r>
+              <w:rPr>
+                <w:b/>
+              </w:rPr>
+            </w:r>
+            <w:r>
+              <w:rPr>
+                <w:rFonts w:ascii="Calibri" w:hAnsi="Calibri" w:eastAsia="Calibri"/>
+                <w:b/>
+                <w:i w:val="0"/>
+                <w:sz w:val="18"/>
+              </w:rPr>
+              <w:t>Signature</w:t>
+            </w:r>
+          </w:p>
+        </w:tc>
+        <w:tc>
+          <w:tcPr>
+            <w:tcW w:type="dxa" w:w="1569"/>
+            <w:shd w:fill="E6EEF2" w:val="clear"/>
+          </w:tcPr>
+          <w:p>
+            <w:pPr>
+              <w:spacing w:after="40" w:before="40"/>
+            </w:pPr>
+            <w:r>
+              <w:rPr>
+                <w:b/>
+              </w:rPr>
+            </w:r>
+            <w:r>
+              <w:rPr>
+                <w:rFonts w:ascii="Calibri" w:hAnsi="Calibri" w:eastAsia="Calibri"/>
+                <w:b/>
+                <w:i w:val="0"/>
+                <w:sz w:val="18"/>
+              </w:rPr>
+              <w:t>Date</w:t>
+            </w:r>
+          </w:p>
+        </w:tc>
+      </w:tr>
+      <w:tr>
+        <w:tc>
+          <w:tcPr>
+            <w:tcW w:type="dxa" w:w="1569"/>
+          </w:tcPr>
+          <w:p>
+            <w:pPr>
+              <w:spacing w:after="40" w:before="40"/>
+            </w:pPr>
+            <w:r/>
+            <w:r>
+              <w:rPr>
+                <w:rFonts w:ascii="Calibri" w:hAnsi="Calibri" w:eastAsia="Calibri"/>
+                <w:b w:val="0"/>
+                <w:i w:val="0"/>
+                <w:sz w:val="18"/>
+              </w:rPr>
+              <w:t>Mpumelelo Ngozo</w:t>
+            </w:r>
+          </w:p>
+        </w:tc>
+        <w:tc>
+          <w:tcPr>
+            <w:tcW w:type="dxa" w:w="1569"/>
+          </w:tcPr>
+          <w:p>
+            <w:pPr>
+              <w:spacing w:after="40" w:before="40"/>
+            </w:pPr>
+            <w:r/>
+            <w:r>
+              <w:rPr>
+                <w:rFonts w:ascii="Calibri" w:hAnsi="Calibri" w:eastAsia="Calibri"/>
+                <w:b w:val="0"/>
+                <w:i w:val="0"/>
+                <w:sz w:val="18"/>
+              </w:rPr>
+              <w:t>MSP</w:t>
+            </w:r>
+          </w:p>
+        </w:tc>
+        <w:tc>
+          <w:tcPr>
+            <w:tcW w:type="dxa" w:w="1569"/>
+          </w:tcPr>
+          <w:p>
+            <w:pPr>
+              <w:spacing w:after="40" w:before="40"/>
+            </w:pPr>
+            <w:r/>
+            <w:r>
+              <w:rPr>
+                <w:rFonts w:ascii="Calibri" w:hAnsi="Calibri" w:eastAsia="Calibri"/>
+                <w:b w:val="0"/>
+                <w:i w:val="0"/>
+                <w:sz w:val="18"/>
+              </w:rPr>
+              <w:t>218409202</w:t>
+            </w:r>
+          </w:p>
+        </w:tc>
+        <w:tc>
+          <w:tcPr>
+            <w:tcW w:type="dxa" w:w="1569"/>
+          </w:tcPr>
+          <w:p>
+            <w:pPr>
+              <w:spacing w:after="40" w:before="40"/>
+            </w:pPr>
+            <w:r/>
+            <w:r>
+              <w:rPr>
+                <w:rFonts w:ascii="Calibri" w:hAnsi="Calibri" w:eastAsia="Calibri"/>
+                <w:b w:val="0"/>
+                <w:i w:val="0"/>
+                <w:sz w:val="18"/>
+              </w:rPr>
+              <w:t>218409202@tut4life.ac.za</w:t>
+            </w:r>
+          </w:p>
+        </w:tc>
+        <w:tc>
+          <w:tcPr>
+            <w:tcW w:type="dxa" w:w="1569"/>
+          </w:tcPr>
+          <w:p>
+            <w:pPr>
+              <w:spacing w:after="40" w:before="40"/>
+            </w:pPr>
+            <w:r/>
+          </w:p>
+        </w:tc>
+        <w:tc>
+          <w:tcPr>
+            <w:tcW w:type="dxa" w:w="1569"/>
+          </w:tcPr>
+          <w:p>
+            <w:pPr>
+              <w:spacing w:after="40" w:before="40"/>
+            </w:pPr>
+            <w:r/>
+          </w:p>
+        </w:tc>
+      </w:tr>
+      <w:tr>
+        <w:tc>
+          <w:tcPr>
+            <w:tcW w:type="dxa" w:w="1569"/>
+          </w:tcPr>
+          <w:p>
+            <w:pPr>
+              <w:spacing w:after="40" w:before="40"/>
+            </w:pPr>
+            <w:r/>
+            <w:r>
+              <w:rPr>
+                <w:rFonts w:ascii="Calibri" w:hAnsi="Calibri" w:eastAsia="Calibri"/>
+                <w:b w:val="0"/>
+                <w:i w:val="0"/>
+                <w:sz w:val="18"/>
+              </w:rPr>
+              <w:t>Selowa Tumiso</w:t>
+            </w:r>
+          </w:p>
+        </w:tc>
+        <w:tc>
+          <w:tcPr>
+            <w:tcW w:type="dxa" w:w="1569"/>
+          </w:tcPr>
+          <w:p>
+            <w:pPr>
+              <w:spacing w:after="40" w:before="40"/>
+            </w:pPr>
+            <w:r/>
+            <w:r>
+              <w:rPr>
+                <w:rFonts w:ascii="Calibri" w:hAnsi="Calibri" w:eastAsia="Calibri"/>
+                <w:b w:val="0"/>
+                <w:i w:val="0"/>
+                <w:sz w:val="18"/>
+              </w:rPr>
+              <w:t>TS</w:t>
+            </w:r>
+          </w:p>
+        </w:tc>
+        <w:tc>
+          <w:tcPr>
+            <w:tcW w:type="dxa" w:w="1569"/>
+          </w:tcPr>
+          <w:p>
+            <w:pPr>
+              <w:spacing w:after="40" w:before="40"/>
+            </w:pPr>
+            <w:r/>
+            <w:r>
+              <w:rPr>
+                <w:rFonts w:ascii="Calibri" w:hAnsi="Calibri" w:eastAsia="Calibri"/>
+                <w:b w:val="0"/>
+                <w:i w:val="0"/>
+                <w:sz w:val="18"/>
+              </w:rPr>
+              <w:t>218340172</w:t>
+            </w:r>
+          </w:p>
+        </w:tc>
+        <w:tc>
+          <w:tcPr>
+            <w:tcW w:type="dxa" w:w="1569"/>
+          </w:tcPr>
+          <w:p>
+            <w:pPr>
+              <w:spacing w:after="40" w:before="40"/>
+            </w:pPr>
+            <w:r/>
+            <w:r>
+              <w:rPr>
+                <w:rFonts w:ascii="Calibri" w:hAnsi="Calibri" w:eastAsia="Calibri"/>
+                <w:b w:val="0"/>
+                <w:i w:val="0"/>
+                <w:sz w:val="18"/>
+              </w:rPr>
+              <w:t>218340172@tut4life.ac.za</w:t>
+            </w:r>
+          </w:p>
+        </w:tc>
+        <w:tc>
+          <w:tcPr>
+            <w:tcW w:type="dxa" w:w="1569"/>
+          </w:tcPr>
+          <w:p>
+            <w:pPr>
+              <w:spacing w:after="40" w:before="40"/>
+            </w:pPr>
+            <w:r/>
+          </w:p>
+        </w:tc>
+        <w:tc>
+          <w:tcPr>
+            <w:tcW w:type="dxa" w:w="1569"/>
+          </w:tcPr>
+          <w:p>
+            <w:pPr>
+              <w:spacing w:after="40" w:before="40"/>
+            </w:pPr>
+            <w:r/>
+          </w:p>
+        </w:tc>
+      </w:tr>
+      <w:tr>
+        <w:tc>
+          <w:tcPr>
+            <w:tcW w:type="dxa" w:w="1569"/>
+          </w:tcPr>
+          <w:p>
+            <w:pPr>
+              <w:spacing w:after="40" w:before="40"/>
+            </w:pPr>
+            <w:r/>
+            <w:r>
+              <w:rPr>
+                <w:rFonts w:ascii="Calibri" w:hAnsi="Calibri" w:eastAsia="Calibri"/>
+                <w:b w:val="0"/>
+                <w:i w:val="0"/>
+                <w:sz w:val="18"/>
+              </w:rPr>
+              <w:t>Ualwela Netshidzati</w:t>
+            </w:r>
+          </w:p>
+        </w:tc>
+        <w:tc>
+          <w:tcPr>
+            <w:tcW w:type="dxa" w:w="1569"/>
+          </w:tcPr>
+          <w:p>
+            <w:pPr>
+              <w:spacing w:after="40" w:before="40"/>
+            </w:pPr>
+            <w:r/>
+            <w:r>
+              <w:rPr>
+                <w:rFonts w:ascii="Calibri" w:hAnsi="Calibri" w:eastAsia="Calibri"/>
+                <w:b w:val="0"/>
+                <w:i w:val="0"/>
+                <w:sz w:val="18"/>
+              </w:rPr>
+              <w:t>U</w:t>
+            </w:r>
+          </w:p>
+        </w:tc>
+        <w:tc>
+          <w:tcPr>
+            <w:tcW w:type="dxa" w:w="1569"/>
+          </w:tcPr>
+          <w:p>
+            <w:pPr>
+              <w:spacing w:after="40" w:before="40"/>
+            </w:pPr>
+            <w:r/>
+            <w:r>
+              <w:rPr>
+                <w:rFonts w:ascii="Calibri" w:hAnsi="Calibri" w:eastAsia="Calibri"/>
+                <w:b w:val="0"/>
+                <w:i w:val="0"/>
+                <w:sz w:val="18"/>
+              </w:rPr>
+              <w:t>220069117</w:t>
+            </w:r>
+          </w:p>
+        </w:tc>
+        <w:tc>
+          <w:tcPr>
+            <w:tcW w:type="dxa" w:w="1569"/>
+          </w:tcPr>
+          <w:p>
+            <w:pPr>
+              <w:spacing w:after="40" w:before="40"/>
+            </w:pPr>
+            <w:r/>
+            <w:r>
+              <w:rPr>
+                <w:rFonts w:ascii="Calibri" w:hAnsi="Calibri" w:eastAsia="Calibri"/>
+                <w:b w:val="0"/>
+                <w:i w:val="0"/>
+                <w:sz w:val="18"/>
+              </w:rPr>
+              <w:t>220069117@tut4life.ac.za</w:t>
+            </w:r>
+          </w:p>
+        </w:tc>
+        <w:tc>
+          <w:tcPr>
+            <w:tcW w:type="dxa" w:w="1569"/>
+          </w:tcPr>
+          <w:p>
+            <w:pPr>
+              <w:spacing w:after="40" w:before="40"/>
+            </w:pPr>
+            <w:r/>
+          </w:p>
+        </w:tc>
+        <w:tc>
+          <w:tcPr>
+            <w:tcW w:type="dxa" w:w="1569"/>
+          </w:tcPr>
+          <w:p>
+            <w:pPr>
+              <w:spacing w:after="40" w:before="40"/>
+            </w:pPr>
+            <w:r/>
+          </w:p>
+        </w:tc>
+      </w:tr>
+      <w:tr>
+        <w:tc>
+          <w:tcPr>
+            <w:tcW w:type="dxa" w:w="1569"/>
+          </w:tcPr>
+          <w:p>
+            <w:pPr>
+              <w:spacing w:after="40" w:before="40"/>
+            </w:pPr>
+            <w:r/>
+            <w:r>
+              <w:rPr>
+                <w:rFonts w:ascii="Calibri" w:hAnsi="Calibri" w:eastAsia="Calibri"/>
+                <w:b w:val="0"/>
+                <w:i w:val="0"/>
+                <w:sz w:val="18"/>
+              </w:rPr>
+              <w:t>Thabang Mokoena</w:t>
+            </w:r>
+          </w:p>
+        </w:tc>
+        <w:tc>
+          <w:tcPr>
+            <w:tcW w:type="dxa" w:w="1569"/>
+          </w:tcPr>
+          <w:p>
+            <w:pPr>
+              <w:spacing w:after="40" w:before="40"/>
+            </w:pPr>
+            <w:r/>
+            <w:r>
+              <w:rPr>
+                <w:rFonts w:ascii="Calibri" w:hAnsi="Calibri" w:eastAsia="Calibri"/>
+                <w:b w:val="0"/>
+                <w:i w:val="0"/>
+                <w:sz w:val="18"/>
+              </w:rPr>
+              <w:t>TG</w:t>
+            </w:r>
+          </w:p>
+        </w:tc>
+        <w:tc>
+          <w:tcPr>
+            <w:tcW w:type="dxa" w:w="1569"/>
+          </w:tcPr>
+          <w:p>
+            <w:pPr>
+              <w:spacing w:after="40" w:before="40"/>
+            </w:pPr>
+            <w:r/>
+            <w:r>
+              <w:rPr>
+                <w:rFonts w:ascii="Calibri" w:hAnsi="Calibri" w:eastAsia="Calibri"/>
+                <w:b w:val="0"/>
+                <w:i w:val="0"/>
+                <w:sz w:val="18"/>
+              </w:rPr>
+              <w:t>240668823</w:t>
+            </w:r>
+          </w:p>
+        </w:tc>
+        <w:tc>
+          <w:tcPr>
+            <w:tcW w:type="dxa" w:w="1569"/>
+          </w:tcPr>
+          <w:p>
+            <w:pPr>
+              <w:spacing w:after="40" w:before="40"/>
+            </w:pPr>
+            <w:r/>
+            <w:r>
+              <w:rPr>
+                <w:rFonts w:ascii="Calibri" w:hAnsi="Calibri" w:eastAsia="Calibri"/>
+                <w:b w:val="0"/>
+                <w:i w:val="0"/>
+                <w:sz w:val="18"/>
+              </w:rPr>
+              <w:t>240668823@tut4life.ac.za</w:t>
+            </w:r>
+          </w:p>
+        </w:tc>
+        <w:tc>
+          <w:tcPr>
+            <w:tcW w:type="dxa" w:w="1569"/>
+          </w:tcPr>
+          <w:p>
+            <w:pPr>
+              <w:spacing w:after="40" w:before="40"/>
+            </w:pPr>
+            <w:r/>
+          </w:p>
+        </w:tc>
+        <w:tc>
+          <w:tcPr>
+            <w:tcW w:type="dxa" w:w="1569"/>
+          </w:tcPr>
+          <w:p>
+            <w:pPr>
+              <w:spacing w:after="40" w:before="40"/>
+            </w:pPr>
+            <w:r/>
+          </w:p>
+        </w:tc>
+      </w:tr>
+    </w:tbl>
+    <w:p/>
     <w:p>
       <w:r>
         <w:rPr>
@@ -29,7 +622,7 @@
           <w:i w:val="0"/>
           <w:sz w:val="22"/>
         </w:rPr>
-        <w:t xml:space="preserve">The only human name in the git history is Thabang Mokoena, on four commits dated 15 October 2026: the initial repository, the README, the </w:t>
+        <w:t xml:space="preserve">The repository records four commits on 15 October 2026 by Thabang Mokoena: the initial repository, the README, the </w:t>
       </w:r>
       <w:r>
         <w:rPr>
@@ -65,7 +658,7 @@
           <w:i w:val="0"/>
           <w:sz w:val="22"/>
         </w:rPr>
-        <w:t>. Later commits are authored Cursor Agent. That history is not a signed division of labour, and it is not a student number. The signature columns stay empty because no signature was supplied. The brief requires every member to sign. This page does not meet that requirement until they do.</w:t>
+        <w:t>. Later commits are authored Cursor Agent. That record is not a signed division of labour. It does not assign the later modelling, the report, or the interface to him, and it does not describe work by Mpumelelo Ngozo, Selowa Tumiso, or Ualwela Netshidzati. No separate task description is written for those three members, because the repository does not say which tasks they completed. The signature columns stay empty because no signature was supplied. The brief requires every member to sign. This page does not meet that requirement until they do.</w:t>
       </w:r>
     </w:p>
     <w:p>
@@ -95,6 +688,25 @@
           <w:sz w:val="22"/>
         </w:rPr>
         <w:t xml:space="preserve"> is a speaking outline of about 11 minutes. It is not a slide file, not an attendance record, and not a defence result. The presentation window in the brief is 5–17 October 2026. This repository has no evidence that the presentation was given.</w:t>
+      </w:r>
+    </w:p>
+    <w:p>
+      <w:pPr>
+        <w:pStyle w:val="Heading2"/>
+      </w:pPr>
+      <w:r>
+        <w:t>Contribution matrix</w:t>
+      </w:r>
+    </w:p>
+    <w:p>
+      <w:r>
+        <w:rPr>
+          <w:rFonts w:ascii="Calibri" w:hAnsi="Calibri" w:eastAsia="Calibri"/>
+          <w:b w:val="0"/>
+          <w:i w:val="0"/>
+          <w:sz w:val="22"/>
+        </w:rPr>
+        <w:t>Each cell is “To be confirmed by the team” because the repository does not show which member completed that category. The four scaffold commits named above are not entered as a completed category.</w:t>
       </w:r>
     </w:p>
     <w:tbl>
@@ -133,7 +745,7 @@
                 <w:i w:val="0"/>
                 <w:sz w:val="18"/>
               </w:rPr>
-              <w:t>Work that exists in the repository</w:t>
+              <w:t>Contribution</w:t>
             </w:r>
           </w:p>
         </w:tc>
@@ -158,7 +770,1087 @@
                 <w:i w:val="0"/>
                 <w:sz w:val="18"/>
               </w:rPr>
-              <w:t>Name</w:t>
+              <w:t>Mpumelelo Ngozo (218409202)</w:t>
+            </w:r>
+          </w:p>
+        </w:tc>
+        <w:tc>
+          <w:tcPr>
+            <w:tcW w:type="dxa" w:w="1882"/>
+            <w:shd w:fill="E6EEF2" w:val="clear"/>
+          </w:tcPr>
+          <w:p>
+            <w:pPr>
+              <w:spacing w:after="40" w:before="40"/>
+            </w:pPr>
+            <w:r>
+              <w:rPr>
+                <w:b/>
+              </w:rPr>
+            </w:r>
+            <w:r>
+              <w:rPr>
+                <w:rFonts w:ascii="Calibri" w:hAnsi="Calibri" w:eastAsia="Calibri"/>
+                <w:b/>
+                <w:i w:val="0"/>
+                <w:sz w:val="18"/>
+              </w:rPr>
+              <w:t>Selowa Tumiso (218340172)</w:t>
+            </w:r>
+          </w:p>
+        </w:tc>
+        <w:tc>
+          <w:tcPr>
+            <w:tcW w:type="dxa" w:w="1882"/>
+            <w:shd w:fill="E6EEF2" w:val="clear"/>
+          </w:tcPr>
+          <w:p>
+            <w:pPr>
+              <w:spacing w:after="40" w:before="40"/>
+            </w:pPr>
+            <w:r>
+              <w:rPr>
+                <w:b/>
+              </w:rPr>
+            </w:r>
+            <w:r>
+              <w:rPr>
+                <w:rFonts w:ascii="Calibri" w:hAnsi="Calibri" w:eastAsia="Calibri"/>
+                <w:b/>
+                <w:i w:val="0"/>
+                <w:sz w:val="18"/>
+              </w:rPr>
+              <w:t>Ualwela Netshidzati (220069117)</w:t>
+            </w:r>
+          </w:p>
+        </w:tc>
+        <w:tc>
+          <w:tcPr>
+            <w:tcW w:type="dxa" w:w="1882"/>
+            <w:shd w:fill="E6EEF2" w:val="clear"/>
+          </w:tcPr>
+          <w:p>
+            <w:pPr>
+              <w:spacing w:after="40" w:before="40"/>
+            </w:pPr>
+            <w:r>
+              <w:rPr>
+                <w:b/>
+              </w:rPr>
+            </w:r>
+            <w:r>
+              <w:rPr>
+                <w:rFonts w:ascii="Calibri" w:hAnsi="Calibri" w:eastAsia="Calibri"/>
+                <w:b/>
+                <w:i w:val="0"/>
+                <w:sz w:val="18"/>
+              </w:rPr>
+              <w:t>Thabang Mokoena (240668823)</w:t>
+            </w:r>
+          </w:p>
+        </w:tc>
+      </w:tr>
+      <w:tr>
+        <w:tc>
+          <w:tcPr>
+            <w:tcW w:type="dxa" w:w="1882"/>
+          </w:tcPr>
+          <w:p>
+            <w:pPr>
+              <w:spacing w:after="40" w:before="40"/>
+            </w:pPr>
+            <w:r/>
+            <w:r>
+              <w:rPr>
+                <w:rFonts w:ascii="Calibri" w:hAnsi="Calibri" w:eastAsia="Calibri"/>
+                <w:b w:val="0"/>
+                <w:i w:val="0"/>
+                <w:sz w:val="18"/>
+              </w:rPr>
+              <w:t>Problem definition and project planning</w:t>
+            </w:r>
+          </w:p>
+        </w:tc>
+        <w:tc>
+          <w:tcPr>
+            <w:tcW w:type="dxa" w:w="1882"/>
+          </w:tcPr>
+          <w:p>
+            <w:pPr>
+              <w:spacing w:after="40" w:before="40"/>
+            </w:pPr>
+            <w:r/>
+            <w:r>
+              <w:rPr>
+                <w:rFonts w:ascii="Calibri" w:hAnsi="Calibri" w:eastAsia="Calibri"/>
+                <w:b w:val="0"/>
+                <w:i w:val="0"/>
+                <w:sz w:val="18"/>
+              </w:rPr>
+              <w:t>To be confirmed by the team</w:t>
+            </w:r>
+          </w:p>
+        </w:tc>
+        <w:tc>
+          <w:tcPr>
+            <w:tcW w:type="dxa" w:w="1882"/>
+          </w:tcPr>
+          <w:p>
+            <w:pPr>
+              <w:spacing w:after="40" w:before="40"/>
+            </w:pPr>
+            <w:r/>
+            <w:r>
+              <w:rPr>
+                <w:rFonts w:ascii="Calibri" w:hAnsi="Calibri" w:eastAsia="Calibri"/>
+                <w:b w:val="0"/>
+                <w:i w:val="0"/>
+                <w:sz w:val="18"/>
+              </w:rPr>
+              <w:t>To be confirmed by the team</w:t>
+            </w:r>
+          </w:p>
+        </w:tc>
+        <w:tc>
+          <w:tcPr>
+            <w:tcW w:type="dxa" w:w="1882"/>
+          </w:tcPr>
+          <w:p>
+            <w:pPr>
+              <w:spacing w:after="40" w:before="40"/>
+            </w:pPr>
+            <w:r/>
+            <w:r>
+              <w:rPr>
+                <w:rFonts w:ascii="Calibri" w:hAnsi="Calibri" w:eastAsia="Calibri"/>
+                <w:b w:val="0"/>
+                <w:i w:val="0"/>
+                <w:sz w:val="18"/>
+              </w:rPr>
+              <w:t>To be confirmed by the team</w:t>
+            </w:r>
+          </w:p>
+        </w:tc>
+        <w:tc>
+          <w:tcPr>
+            <w:tcW w:type="dxa" w:w="1882"/>
+          </w:tcPr>
+          <w:p>
+            <w:pPr>
+              <w:spacing w:after="40" w:before="40"/>
+            </w:pPr>
+            <w:r/>
+            <w:r>
+              <w:rPr>
+                <w:rFonts w:ascii="Calibri" w:hAnsi="Calibri" w:eastAsia="Calibri"/>
+                <w:b w:val="0"/>
+                <w:i w:val="0"/>
+                <w:sz w:val="18"/>
+              </w:rPr>
+              <w:t>To be confirmed by the team</w:t>
+            </w:r>
+          </w:p>
+        </w:tc>
+      </w:tr>
+      <w:tr>
+        <w:tc>
+          <w:tcPr>
+            <w:tcW w:type="dxa" w:w="1882"/>
+          </w:tcPr>
+          <w:p>
+            <w:pPr>
+              <w:spacing w:after="40" w:before="40"/>
+            </w:pPr>
+            <w:r/>
+            <w:r>
+              <w:rPr>
+                <w:rFonts w:ascii="Calibri" w:hAnsi="Calibri" w:eastAsia="Calibri"/>
+                <w:b w:val="0"/>
+                <w:i w:val="0"/>
+                <w:sz w:val="18"/>
+              </w:rPr>
+              <w:t>Data collection, audit and cleaning</w:t>
+            </w:r>
+          </w:p>
+        </w:tc>
+        <w:tc>
+          <w:tcPr>
+            <w:tcW w:type="dxa" w:w="1882"/>
+          </w:tcPr>
+          <w:p>
+            <w:pPr>
+              <w:spacing w:after="40" w:before="40"/>
+            </w:pPr>
+            <w:r/>
+            <w:r>
+              <w:rPr>
+                <w:rFonts w:ascii="Calibri" w:hAnsi="Calibri" w:eastAsia="Calibri"/>
+                <w:b w:val="0"/>
+                <w:i w:val="0"/>
+                <w:sz w:val="18"/>
+              </w:rPr>
+              <w:t>To be confirmed by the team</w:t>
+            </w:r>
+          </w:p>
+        </w:tc>
+        <w:tc>
+          <w:tcPr>
+            <w:tcW w:type="dxa" w:w="1882"/>
+          </w:tcPr>
+          <w:p>
+            <w:pPr>
+              <w:spacing w:after="40" w:before="40"/>
+            </w:pPr>
+            <w:r/>
+            <w:r>
+              <w:rPr>
+                <w:rFonts w:ascii="Calibri" w:hAnsi="Calibri" w:eastAsia="Calibri"/>
+                <w:b w:val="0"/>
+                <w:i w:val="0"/>
+                <w:sz w:val="18"/>
+              </w:rPr>
+              <w:t>To be confirmed by the team</w:t>
+            </w:r>
+          </w:p>
+        </w:tc>
+        <w:tc>
+          <w:tcPr>
+            <w:tcW w:type="dxa" w:w="1882"/>
+          </w:tcPr>
+          <w:p>
+            <w:pPr>
+              <w:spacing w:after="40" w:before="40"/>
+            </w:pPr>
+            <w:r/>
+            <w:r>
+              <w:rPr>
+                <w:rFonts w:ascii="Calibri" w:hAnsi="Calibri" w:eastAsia="Calibri"/>
+                <w:b w:val="0"/>
+                <w:i w:val="0"/>
+                <w:sz w:val="18"/>
+              </w:rPr>
+              <w:t>To be confirmed by the team</w:t>
+            </w:r>
+          </w:p>
+        </w:tc>
+        <w:tc>
+          <w:tcPr>
+            <w:tcW w:type="dxa" w:w="1882"/>
+          </w:tcPr>
+          <w:p>
+            <w:pPr>
+              <w:spacing w:after="40" w:before="40"/>
+            </w:pPr>
+            <w:r/>
+            <w:r>
+              <w:rPr>
+                <w:rFonts w:ascii="Calibri" w:hAnsi="Calibri" w:eastAsia="Calibri"/>
+                <w:b w:val="0"/>
+                <w:i w:val="0"/>
+                <w:sz w:val="18"/>
+              </w:rPr>
+              <w:t>To be confirmed by the team</w:t>
+            </w:r>
+          </w:p>
+        </w:tc>
+      </w:tr>
+      <w:tr>
+        <w:tc>
+          <w:tcPr>
+            <w:tcW w:type="dxa" w:w="1882"/>
+          </w:tcPr>
+          <w:p>
+            <w:pPr>
+              <w:spacing w:after="40" w:before="40"/>
+            </w:pPr>
+            <w:r/>
+            <w:r>
+              <w:rPr>
+                <w:rFonts w:ascii="Calibri" w:hAnsi="Calibri" w:eastAsia="Calibri"/>
+                <w:b w:val="0"/>
+                <w:i w:val="0"/>
+                <w:sz w:val="18"/>
+              </w:rPr>
+              <w:t>Exploratory data analysis</w:t>
+            </w:r>
+          </w:p>
+        </w:tc>
+        <w:tc>
+          <w:tcPr>
+            <w:tcW w:type="dxa" w:w="1882"/>
+          </w:tcPr>
+          <w:p>
+            <w:pPr>
+              <w:spacing w:after="40" w:before="40"/>
+            </w:pPr>
+            <w:r/>
+            <w:r>
+              <w:rPr>
+                <w:rFonts w:ascii="Calibri" w:hAnsi="Calibri" w:eastAsia="Calibri"/>
+                <w:b w:val="0"/>
+                <w:i w:val="0"/>
+                <w:sz w:val="18"/>
+              </w:rPr>
+              <w:t>To be confirmed by the team</w:t>
+            </w:r>
+          </w:p>
+        </w:tc>
+        <w:tc>
+          <w:tcPr>
+            <w:tcW w:type="dxa" w:w="1882"/>
+          </w:tcPr>
+          <w:p>
+            <w:pPr>
+              <w:spacing w:after="40" w:before="40"/>
+            </w:pPr>
+            <w:r/>
+            <w:r>
+              <w:rPr>
+                <w:rFonts w:ascii="Calibri" w:hAnsi="Calibri" w:eastAsia="Calibri"/>
+                <w:b w:val="0"/>
+                <w:i w:val="0"/>
+                <w:sz w:val="18"/>
+              </w:rPr>
+              <w:t>To be confirmed by the team</w:t>
+            </w:r>
+          </w:p>
+        </w:tc>
+        <w:tc>
+          <w:tcPr>
+            <w:tcW w:type="dxa" w:w="1882"/>
+          </w:tcPr>
+          <w:p>
+            <w:pPr>
+              <w:spacing w:after="40" w:before="40"/>
+            </w:pPr>
+            <w:r/>
+            <w:r>
+              <w:rPr>
+                <w:rFonts w:ascii="Calibri" w:hAnsi="Calibri" w:eastAsia="Calibri"/>
+                <w:b w:val="0"/>
+                <w:i w:val="0"/>
+                <w:sz w:val="18"/>
+              </w:rPr>
+              <w:t>To be confirmed by the team</w:t>
+            </w:r>
+          </w:p>
+        </w:tc>
+        <w:tc>
+          <w:tcPr>
+            <w:tcW w:type="dxa" w:w="1882"/>
+          </w:tcPr>
+          <w:p>
+            <w:pPr>
+              <w:spacing w:after="40" w:before="40"/>
+            </w:pPr>
+            <w:r/>
+            <w:r>
+              <w:rPr>
+                <w:rFonts w:ascii="Calibri" w:hAnsi="Calibri" w:eastAsia="Calibri"/>
+                <w:b w:val="0"/>
+                <w:i w:val="0"/>
+                <w:sz w:val="18"/>
+              </w:rPr>
+              <w:t>To be confirmed by the team</w:t>
+            </w:r>
+          </w:p>
+        </w:tc>
+      </w:tr>
+      <w:tr>
+        <w:tc>
+          <w:tcPr>
+            <w:tcW w:type="dxa" w:w="1882"/>
+          </w:tcPr>
+          <w:p>
+            <w:pPr>
+              <w:spacing w:after="40" w:before="40"/>
+            </w:pPr>
+            <w:r/>
+            <w:r>
+              <w:rPr>
+                <w:rFonts w:ascii="Calibri" w:hAnsi="Calibri" w:eastAsia="Calibri"/>
+                <w:b w:val="0"/>
+                <w:i w:val="0"/>
+                <w:sz w:val="18"/>
+              </w:rPr>
+              <w:t>Preprocessing and feature engineering</w:t>
+            </w:r>
+          </w:p>
+        </w:tc>
+        <w:tc>
+          <w:tcPr>
+            <w:tcW w:type="dxa" w:w="1882"/>
+          </w:tcPr>
+          <w:p>
+            <w:pPr>
+              <w:spacing w:after="40" w:before="40"/>
+            </w:pPr>
+            <w:r/>
+            <w:r>
+              <w:rPr>
+                <w:rFonts w:ascii="Calibri" w:hAnsi="Calibri" w:eastAsia="Calibri"/>
+                <w:b w:val="0"/>
+                <w:i w:val="0"/>
+                <w:sz w:val="18"/>
+              </w:rPr>
+              <w:t>To be confirmed by the team</w:t>
+            </w:r>
+          </w:p>
+        </w:tc>
+        <w:tc>
+          <w:tcPr>
+            <w:tcW w:type="dxa" w:w="1882"/>
+          </w:tcPr>
+          <w:p>
+            <w:pPr>
+              <w:spacing w:after="40" w:before="40"/>
+            </w:pPr>
+            <w:r/>
+            <w:r>
+              <w:rPr>
+                <w:rFonts w:ascii="Calibri" w:hAnsi="Calibri" w:eastAsia="Calibri"/>
+                <w:b w:val="0"/>
+                <w:i w:val="0"/>
+                <w:sz w:val="18"/>
+              </w:rPr>
+              <w:t>To be confirmed by the team</w:t>
+            </w:r>
+          </w:p>
+        </w:tc>
+        <w:tc>
+          <w:tcPr>
+            <w:tcW w:type="dxa" w:w="1882"/>
+          </w:tcPr>
+          <w:p>
+            <w:pPr>
+              <w:spacing w:after="40" w:before="40"/>
+            </w:pPr>
+            <w:r/>
+            <w:r>
+              <w:rPr>
+                <w:rFonts w:ascii="Calibri" w:hAnsi="Calibri" w:eastAsia="Calibri"/>
+                <w:b w:val="0"/>
+                <w:i w:val="0"/>
+                <w:sz w:val="18"/>
+              </w:rPr>
+              <w:t>To be confirmed by the team</w:t>
+            </w:r>
+          </w:p>
+        </w:tc>
+        <w:tc>
+          <w:tcPr>
+            <w:tcW w:type="dxa" w:w="1882"/>
+          </w:tcPr>
+          <w:p>
+            <w:pPr>
+              <w:spacing w:after="40" w:before="40"/>
+            </w:pPr>
+            <w:r/>
+            <w:r>
+              <w:rPr>
+                <w:rFonts w:ascii="Calibri" w:hAnsi="Calibri" w:eastAsia="Calibri"/>
+                <w:b w:val="0"/>
+                <w:i w:val="0"/>
+                <w:sz w:val="18"/>
+              </w:rPr>
+              <w:t>To be confirmed by the team</w:t>
+            </w:r>
+          </w:p>
+        </w:tc>
+      </w:tr>
+      <w:tr>
+        <w:tc>
+          <w:tcPr>
+            <w:tcW w:type="dxa" w:w="1882"/>
+          </w:tcPr>
+          <w:p>
+            <w:pPr>
+              <w:spacing w:after="40" w:before="40"/>
+            </w:pPr>
+            <w:r/>
+            <w:r>
+              <w:rPr>
+                <w:rFonts w:ascii="Calibri" w:hAnsi="Calibri" w:eastAsia="Calibri"/>
+                <w:b w:val="0"/>
+                <w:i w:val="0"/>
+                <w:sz w:val="18"/>
+              </w:rPr>
+              <w:t>Model development and evaluation</w:t>
+            </w:r>
+          </w:p>
+        </w:tc>
+        <w:tc>
+          <w:tcPr>
+            <w:tcW w:type="dxa" w:w="1882"/>
+          </w:tcPr>
+          <w:p>
+            <w:pPr>
+              <w:spacing w:after="40" w:before="40"/>
+            </w:pPr>
+            <w:r/>
+            <w:r>
+              <w:rPr>
+                <w:rFonts w:ascii="Calibri" w:hAnsi="Calibri" w:eastAsia="Calibri"/>
+                <w:b w:val="0"/>
+                <w:i w:val="0"/>
+                <w:sz w:val="18"/>
+              </w:rPr>
+              <w:t>To be confirmed by the team</w:t>
+            </w:r>
+          </w:p>
+        </w:tc>
+        <w:tc>
+          <w:tcPr>
+            <w:tcW w:type="dxa" w:w="1882"/>
+          </w:tcPr>
+          <w:p>
+            <w:pPr>
+              <w:spacing w:after="40" w:before="40"/>
+            </w:pPr>
+            <w:r/>
+            <w:r>
+              <w:rPr>
+                <w:rFonts w:ascii="Calibri" w:hAnsi="Calibri" w:eastAsia="Calibri"/>
+                <w:b w:val="0"/>
+                <w:i w:val="0"/>
+                <w:sz w:val="18"/>
+              </w:rPr>
+              <w:t>To be confirmed by the team</w:t>
+            </w:r>
+          </w:p>
+        </w:tc>
+        <w:tc>
+          <w:tcPr>
+            <w:tcW w:type="dxa" w:w="1882"/>
+          </w:tcPr>
+          <w:p>
+            <w:pPr>
+              <w:spacing w:after="40" w:before="40"/>
+            </w:pPr>
+            <w:r/>
+            <w:r>
+              <w:rPr>
+                <w:rFonts w:ascii="Calibri" w:hAnsi="Calibri" w:eastAsia="Calibri"/>
+                <w:b w:val="0"/>
+                <w:i w:val="0"/>
+                <w:sz w:val="18"/>
+              </w:rPr>
+              <w:t>To be confirmed by the team</w:t>
+            </w:r>
+          </w:p>
+        </w:tc>
+        <w:tc>
+          <w:tcPr>
+            <w:tcW w:type="dxa" w:w="1882"/>
+          </w:tcPr>
+          <w:p>
+            <w:pPr>
+              <w:spacing w:after="40" w:before="40"/>
+            </w:pPr>
+            <w:r/>
+            <w:r>
+              <w:rPr>
+                <w:rFonts w:ascii="Calibri" w:hAnsi="Calibri" w:eastAsia="Calibri"/>
+                <w:b w:val="0"/>
+                <w:i w:val="0"/>
+                <w:sz w:val="18"/>
+              </w:rPr>
+              <w:t>To be confirmed by the team</w:t>
+            </w:r>
+          </w:p>
+        </w:tc>
+      </w:tr>
+      <w:tr>
+        <w:tc>
+          <w:tcPr>
+            <w:tcW w:type="dxa" w:w="1882"/>
+          </w:tcPr>
+          <w:p>
+            <w:pPr>
+              <w:spacing w:after="40" w:before="40"/>
+            </w:pPr>
+            <w:r/>
+            <w:r>
+              <w:rPr>
+                <w:rFonts w:ascii="Calibri" w:hAnsi="Calibri" w:eastAsia="Calibri"/>
+                <w:b w:val="0"/>
+                <w:i w:val="0"/>
+                <w:sz w:val="18"/>
+              </w:rPr>
+              <w:t>Statistical comparisons and ablation analysis</w:t>
+            </w:r>
+          </w:p>
+        </w:tc>
+        <w:tc>
+          <w:tcPr>
+            <w:tcW w:type="dxa" w:w="1882"/>
+          </w:tcPr>
+          <w:p>
+            <w:pPr>
+              <w:spacing w:after="40" w:before="40"/>
+            </w:pPr>
+            <w:r/>
+            <w:r>
+              <w:rPr>
+                <w:rFonts w:ascii="Calibri" w:hAnsi="Calibri" w:eastAsia="Calibri"/>
+                <w:b w:val="0"/>
+                <w:i w:val="0"/>
+                <w:sz w:val="18"/>
+              </w:rPr>
+              <w:t>To be confirmed by the team</w:t>
+            </w:r>
+          </w:p>
+        </w:tc>
+        <w:tc>
+          <w:tcPr>
+            <w:tcW w:type="dxa" w:w="1882"/>
+          </w:tcPr>
+          <w:p>
+            <w:pPr>
+              <w:spacing w:after="40" w:before="40"/>
+            </w:pPr>
+            <w:r/>
+            <w:r>
+              <w:rPr>
+                <w:rFonts w:ascii="Calibri" w:hAnsi="Calibri" w:eastAsia="Calibri"/>
+                <w:b w:val="0"/>
+                <w:i w:val="0"/>
+                <w:sz w:val="18"/>
+              </w:rPr>
+              <w:t>To be confirmed by the team</w:t>
+            </w:r>
+          </w:p>
+        </w:tc>
+        <w:tc>
+          <w:tcPr>
+            <w:tcW w:type="dxa" w:w="1882"/>
+          </w:tcPr>
+          <w:p>
+            <w:pPr>
+              <w:spacing w:after="40" w:before="40"/>
+            </w:pPr>
+            <w:r/>
+            <w:r>
+              <w:rPr>
+                <w:rFonts w:ascii="Calibri" w:hAnsi="Calibri" w:eastAsia="Calibri"/>
+                <w:b w:val="0"/>
+                <w:i w:val="0"/>
+                <w:sz w:val="18"/>
+              </w:rPr>
+              <w:t>To be confirmed by the team</w:t>
+            </w:r>
+          </w:p>
+        </w:tc>
+        <w:tc>
+          <w:tcPr>
+            <w:tcW w:type="dxa" w:w="1882"/>
+          </w:tcPr>
+          <w:p>
+            <w:pPr>
+              <w:spacing w:after="40" w:before="40"/>
+            </w:pPr>
+            <w:r/>
+            <w:r>
+              <w:rPr>
+                <w:rFonts w:ascii="Calibri" w:hAnsi="Calibri" w:eastAsia="Calibri"/>
+                <w:b w:val="0"/>
+                <w:i w:val="0"/>
+                <w:sz w:val="18"/>
+              </w:rPr>
+              <w:t>To be confirmed by the team</w:t>
+            </w:r>
+          </w:p>
+        </w:tc>
+      </w:tr>
+      <w:tr>
+        <w:tc>
+          <w:tcPr>
+            <w:tcW w:type="dxa" w:w="1882"/>
+          </w:tcPr>
+          <w:p>
+            <w:pPr>
+              <w:spacing w:after="40" w:before="40"/>
+            </w:pPr>
+            <w:r/>
+            <w:r>
+              <w:rPr>
+                <w:rFonts w:ascii="Calibri" w:hAnsi="Calibri" w:eastAsia="Calibri"/>
+                <w:b w:val="0"/>
+                <w:i w:val="0"/>
+                <w:sz w:val="18"/>
+              </w:rPr>
+              <w:t>Streamlit interface and deployment</w:t>
+            </w:r>
+          </w:p>
+        </w:tc>
+        <w:tc>
+          <w:tcPr>
+            <w:tcW w:type="dxa" w:w="1882"/>
+          </w:tcPr>
+          <w:p>
+            <w:pPr>
+              <w:spacing w:after="40" w:before="40"/>
+            </w:pPr>
+            <w:r/>
+            <w:r>
+              <w:rPr>
+                <w:rFonts w:ascii="Calibri" w:hAnsi="Calibri" w:eastAsia="Calibri"/>
+                <w:b w:val="0"/>
+                <w:i w:val="0"/>
+                <w:sz w:val="18"/>
+              </w:rPr>
+              <w:t>To be confirmed by the team</w:t>
+            </w:r>
+          </w:p>
+        </w:tc>
+        <w:tc>
+          <w:tcPr>
+            <w:tcW w:type="dxa" w:w="1882"/>
+          </w:tcPr>
+          <w:p>
+            <w:pPr>
+              <w:spacing w:after="40" w:before="40"/>
+            </w:pPr>
+            <w:r/>
+            <w:r>
+              <w:rPr>
+                <w:rFonts w:ascii="Calibri" w:hAnsi="Calibri" w:eastAsia="Calibri"/>
+                <w:b w:val="0"/>
+                <w:i w:val="0"/>
+                <w:sz w:val="18"/>
+              </w:rPr>
+              <w:t>To be confirmed by the team</w:t>
+            </w:r>
+          </w:p>
+        </w:tc>
+        <w:tc>
+          <w:tcPr>
+            <w:tcW w:type="dxa" w:w="1882"/>
+          </w:tcPr>
+          <w:p>
+            <w:pPr>
+              <w:spacing w:after="40" w:before="40"/>
+            </w:pPr>
+            <w:r/>
+            <w:r>
+              <w:rPr>
+                <w:rFonts w:ascii="Calibri" w:hAnsi="Calibri" w:eastAsia="Calibri"/>
+                <w:b w:val="0"/>
+                <w:i w:val="0"/>
+                <w:sz w:val="18"/>
+              </w:rPr>
+              <w:t>To be confirmed by the team</w:t>
+            </w:r>
+          </w:p>
+        </w:tc>
+        <w:tc>
+          <w:tcPr>
+            <w:tcW w:type="dxa" w:w="1882"/>
+          </w:tcPr>
+          <w:p>
+            <w:pPr>
+              <w:spacing w:after="40" w:before="40"/>
+            </w:pPr>
+            <w:r/>
+            <w:r>
+              <w:rPr>
+                <w:rFonts w:ascii="Calibri" w:hAnsi="Calibri" w:eastAsia="Calibri"/>
+                <w:b w:val="0"/>
+                <w:i w:val="0"/>
+                <w:sz w:val="18"/>
+              </w:rPr>
+              <w:t>To be confirmed by the team</w:t>
+            </w:r>
+          </w:p>
+        </w:tc>
+      </w:tr>
+      <w:tr>
+        <w:tc>
+          <w:tcPr>
+            <w:tcW w:type="dxa" w:w="1882"/>
+          </w:tcPr>
+          <w:p>
+            <w:pPr>
+              <w:spacing w:after="40" w:before="40"/>
+            </w:pPr>
+            <w:r/>
+            <w:r>
+              <w:rPr>
+                <w:rFonts w:ascii="Calibri" w:hAnsi="Calibri" w:eastAsia="Calibri"/>
+                <w:b w:val="0"/>
+                <w:i w:val="0"/>
+                <w:sz w:val="18"/>
+              </w:rPr>
+              <w:t>Technical report and references</w:t>
+            </w:r>
+          </w:p>
+        </w:tc>
+        <w:tc>
+          <w:tcPr>
+            <w:tcW w:type="dxa" w:w="1882"/>
+          </w:tcPr>
+          <w:p>
+            <w:pPr>
+              <w:spacing w:after="40" w:before="40"/>
+            </w:pPr>
+            <w:r/>
+            <w:r>
+              <w:rPr>
+                <w:rFonts w:ascii="Calibri" w:hAnsi="Calibri" w:eastAsia="Calibri"/>
+                <w:b w:val="0"/>
+                <w:i w:val="0"/>
+                <w:sz w:val="18"/>
+              </w:rPr>
+              <w:t>To be confirmed by the team</w:t>
+            </w:r>
+          </w:p>
+        </w:tc>
+        <w:tc>
+          <w:tcPr>
+            <w:tcW w:type="dxa" w:w="1882"/>
+          </w:tcPr>
+          <w:p>
+            <w:pPr>
+              <w:spacing w:after="40" w:before="40"/>
+            </w:pPr>
+            <w:r/>
+            <w:r>
+              <w:rPr>
+                <w:rFonts w:ascii="Calibri" w:hAnsi="Calibri" w:eastAsia="Calibri"/>
+                <w:b w:val="0"/>
+                <w:i w:val="0"/>
+                <w:sz w:val="18"/>
+              </w:rPr>
+              <w:t>To be confirmed by the team</w:t>
+            </w:r>
+          </w:p>
+        </w:tc>
+        <w:tc>
+          <w:tcPr>
+            <w:tcW w:type="dxa" w:w="1882"/>
+          </w:tcPr>
+          <w:p>
+            <w:pPr>
+              <w:spacing w:after="40" w:before="40"/>
+            </w:pPr>
+            <w:r/>
+            <w:r>
+              <w:rPr>
+                <w:rFonts w:ascii="Calibri" w:hAnsi="Calibri" w:eastAsia="Calibri"/>
+                <w:b w:val="0"/>
+                <w:i w:val="0"/>
+                <w:sz w:val="18"/>
+              </w:rPr>
+              <w:t>To be confirmed by the team</w:t>
+            </w:r>
+          </w:p>
+        </w:tc>
+        <w:tc>
+          <w:tcPr>
+            <w:tcW w:type="dxa" w:w="1882"/>
+          </w:tcPr>
+          <w:p>
+            <w:pPr>
+              <w:spacing w:after="40" w:before="40"/>
+            </w:pPr>
+            <w:r/>
+            <w:r>
+              <w:rPr>
+                <w:rFonts w:ascii="Calibri" w:hAnsi="Calibri" w:eastAsia="Calibri"/>
+                <w:b w:val="0"/>
+                <w:i w:val="0"/>
+                <w:sz w:val="18"/>
+              </w:rPr>
+              <w:t>To be confirmed by the team</w:t>
+            </w:r>
+          </w:p>
+        </w:tc>
+      </w:tr>
+      <w:tr>
+        <w:tc>
+          <w:tcPr>
+            <w:tcW w:type="dxa" w:w="1882"/>
+          </w:tcPr>
+          <w:p>
+            <w:pPr>
+              <w:spacing w:after="40" w:before="40"/>
+            </w:pPr>
+            <w:r/>
+            <w:r>
+              <w:rPr>
+                <w:rFonts w:ascii="Calibri" w:hAnsi="Calibri" w:eastAsia="Calibri"/>
+                <w:b w:val="0"/>
+                <w:i w:val="0"/>
+                <w:sz w:val="18"/>
+              </w:rPr>
+              <w:t>Presentation preparation and coordination</w:t>
+            </w:r>
+          </w:p>
+        </w:tc>
+        <w:tc>
+          <w:tcPr>
+            <w:tcW w:type="dxa" w:w="1882"/>
+          </w:tcPr>
+          <w:p>
+            <w:pPr>
+              <w:spacing w:after="40" w:before="40"/>
+            </w:pPr>
+            <w:r/>
+            <w:r>
+              <w:rPr>
+                <w:rFonts w:ascii="Calibri" w:hAnsi="Calibri" w:eastAsia="Calibri"/>
+                <w:b w:val="0"/>
+                <w:i w:val="0"/>
+                <w:sz w:val="18"/>
+              </w:rPr>
+              <w:t>To be confirmed by the team</w:t>
+            </w:r>
+          </w:p>
+        </w:tc>
+        <w:tc>
+          <w:tcPr>
+            <w:tcW w:type="dxa" w:w="1882"/>
+          </w:tcPr>
+          <w:p>
+            <w:pPr>
+              <w:spacing w:after="40" w:before="40"/>
+            </w:pPr>
+            <w:r/>
+            <w:r>
+              <w:rPr>
+                <w:rFonts w:ascii="Calibri" w:hAnsi="Calibri" w:eastAsia="Calibri"/>
+                <w:b w:val="0"/>
+                <w:i w:val="0"/>
+                <w:sz w:val="18"/>
+              </w:rPr>
+              <w:t>To be confirmed by the team</w:t>
+            </w:r>
+          </w:p>
+        </w:tc>
+        <w:tc>
+          <w:tcPr>
+            <w:tcW w:type="dxa" w:w="1882"/>
+          </w:tcPr>
+          <w:p>
+            <w:pPr>
+              <w:spacing w:after="40" w:before="40"/>
+            </w:pPr>
+            <w:r/>
+            <w:r>
+              <w:rPr>
+                <w:rFonts w:ascii="Calibri" w:hAnsi="Calibri" w:eastAsia="Calibri"/>
+                <w:b w:val="0"/>
+                <w:i w:val="0"/>
+                <w:sz w:val="18"/>
+              </w:rPr>
+              <w:t>To be confirmed by the team</w:t>
+            </w:r>
+          </w:p>
+        </w:tc>
+        <w:tc>
+          <w:tcPr>
+            <w:tcW w:type="dxa" w:w="1882"/>
+          </w:tcPr>
+          <w:p>
+            <w:pPr>
+              <w:spacing w:after="40" w:before="40"/>
+            </w:pPr>
+            <w:r/>
+            <w:r>
+              <w:rPr>
+                <w:rFonts w:ascii="Calibri" w:hAnsi="Calibri" w:eastAsia="Calibri"/>
+                <w:b w:val="0"/>
+                <w:i w:val="0"/>
+                <w:sz w:val="18"/>
+              </w:rPr>
+              <w:t>To be confirmed by the team</w:t>
+            </w:r>
+          </w:p>
+        </w:tc>
+      </w:tr>
+    </w:tbl>
+    <w:p/>
+    <w:p>
+      <w:pPr>
+        <w:pStyle w:val="Heading2"/>
+      </w:pPr>
+      <w:r>
+        <w:t>Confirmation table</w:t>
+      </w:r>
+    </w:p>
+    <w:p>
+      <w:r>
+        <w:rPr>
+          <w:rFonts w:ascii="Calibri" w:hAnsi="Calibri" w:eastAsia="Calibri"/>
+          <w:b w:val="0"/>
+          <w:i w:val="0"/>
+          <w:sz w:val="22"/>
+        </w:rPr>
+        <w:t>The group confirms that the locked-test scores were not used to choose the champion, and that the embedding-network test score is the Question 6.2 comparison only. The names below identify who may sign. A blank signature means the row is unsigned. Do not sign for a presentation that has not happened. If the institution accepts typed initials as an acknowledgement, the member completes that cell. This file does not do it for them.</w:t>
+      </w:r>
+    </w:p>
+    <w:tbl>
+      <w:tblPr>
+        <w:tblStyle w:val="TableGrid"/>
+        <w:tblW w:type="auto" w:w="0"/>
+        <w:tblLayout w:type="autofit"/>
+        <w:tblLook w:firstColumn="1" w:firstRow="1" w:lastColumn="0" w:lastRow="0" w:noHBand="0" w:noVBand="1" w:val="04A0"/>
+      </w:tblPr>
+      <w:tblGrid>
+        <w:gridCol w:w="1882"/>
+        <w:gridCol w:w="1882"/>
+        <w:gridCol w:w="1882"/>
+        <w:gridCol w:w="1882"/>
+        <w:gridCol w:w="1882"/>
+      </w:tblGrid>
+      <w:tr>
+        <w:tc>
+          <w:tcPr>
+            <w:tcW w:type="dxa" w:w="1882"/>
+            <w:shd w:fill="E6EEF2" w:val="clear"/>
+          </w:tcPr>
+          <w:p>
+            <w:pPr>
+              <w:spacing w:after="40" w:before="40"/>
+            </w:pPr>
+            <w:r>
+              <w:rPr>
+                <w:b/>
+              </w:rPr>
+            </w:r>
+            <w:r>
+              <w:rPr>
+                <w:rFonts w:ascii="Calibri" w:hAnsi="Calibri" w:eastAsia="Calibri"/>
+                <w:b/>
+                <w:i w:val="0"/>
+                <w:sz w:val="18"/>
+              </w:rPr>
+              <w:t>Confirmation</w:t>
+            </w:r>
+          </w:p>
+        </w:tc>
+        <w:tc>
+          <w:tcPr>
+            <w:tcW w:type="dxa" w:w="1882"/>
+            <w:shd w:fill="E6EEF2" w:val="clear"/>
+          </w:tcPr>
+          <w:p>
+            <w:pPr>
+              <w:spacing w:after="40" w:before="40"/>
+            </w:pPr>
+            <w:r>
+              <w:rPr>
+                <w:b/>
+              </w:rPr>
+            </w:r>
+            <w:r>
+              <w:rPr>
+                <w:rFonts w:ascii="Calibri" w:hAnsi="Calibri" w:eastAsia="Calibri"/>
+                <w:b/>
+                <w:i w:val="0"/>
+                <w:sz w:val="18"/>
+              </w:rPr>
+              <w:t>Printed name</w:t>
             </w:r>
           </w:p>
         </w:tc>
@@ -255,7 +1947,7 @@
                 <w:i w:val="0"/>
                 <w:sz w:val="18"/>
               </w:rPr>
-              <w:t>Data source, licence note, and raw-file audit. Notebooks 01 and 02. Data dictionary.</w:t>
+              <w:t>I sign only for rows I did. This row is unsigned.</w:t>
             </w:r>
           </w:p>
         </w:tc>
@@ -268,6 +1960,15 @@
               <w:spacing w:after="40" w:before="40"/>
             </w:pPr>
             <w:r/>
+            <w:r>
+              <w:rPr>
+                <w:rFonts w:ascii="Calibri" w:hAnsi="Calibri" w:eastAsia="Calibri"/>
+                <w:b w:val="0"/>
+                <w:i w:val="0"/>
+                <w:sz w:val="18"/>
+              </w:rPr>
+              <w:t>Mpumelelo Ngozo</w:t>
+            </w:r>
           </w:p>
         </w:tc>
         <w:tc>
@@ -279,6 +1980,15 @@
               <w:spacing w:after="40" w:before="40"/>
             </w:pPr>
             <w:r/>
+            <w:r>
+              <w:rPr>
+                <w:rFonts w:ascii="Calibri" w:hAnsi="Calibri" w:eastAsia="Calibri"/>
+                <w:b w:val="0"/>
+                <w:i w:val="0"/>
+                <w:sz w:val="18"/>
+              </w:rPr>
+              <w:t>218409202</w:t>
+            </w:r>
           </w:p>
         </w:tc>
         <w:tc>
@@ -321,7 +2031,7 @@
                 <w:i w:val="0"/>
                 <w:sz w:val="18"/>
               </w:rPr>
-              <w:t>Label rule, chronological split, and leakage-safe preprocessing.</w:t>
+              <w:t>I sign only for rows I did. This row is unsigned.</w:t>
             </w:r>
           </w:p>
         </w:tc>
@@ -334,6 +2044,15 @@
               <w:spacing w:after="40" w:before="40"/>
             </w:pPr>
             <w:r/>
+            <w:r>
+              <w:rPr>
+                <w:rFonts w:ascii="Calibri" w:hAnsi="Calibri" w:eastAsia="Calibri"/>
+                <w:b w:val="0"/>
+                <w:i w:val="0"/>
+                <w:sz w:val="18"/>
+              </w:rPr>
+              <w:t>Selowa Tumiso</w:t>
+            </w:r>
           </w:p>
         </w:tc>
         <w:tc>
@@ -345,6 +2064,15 @@
               <w:spacing w:after="40" w:before="40"/>
             </w:pPr>
             <w:r/>
+            <w:r>
+              <w:rPr>
+                <w:rFonts w:ascii="Calibri" w:hAnsi="Calibri" w:eastAsia="Calibri"/>
+                <w:b w:val="0"/>
+                <w:i w:val="0"/>
+                <w:sz w:val="18"/>
+              </w:rPr>
+              <w:t>218340172</w:t>
+            </w:r>
           </w:p>
         </w:tc>
         <w:tc>
@@ -387,7 +2115,7 @@
                 <w:i w:val="0"/>
                 <w:sz w:val="18"/>
               </w:rPr>
-              <w:t>Most-frequent dummy and logistic regression, including the recorded non-convergence.</w:t>
+              <w:t>I sign only for rows I did. This row is unsigned.</w:t>
             </w:r>
           </w:p>
         </w:tc>
@@ -400,6 +2128,15 @@
               <w:spacing w:after="40" w:before="40"/>
             </w:pPr>
             <w:r/>
+            <w:r>
+              <w:rPr>
+                <w:rFonts w:ascii="Calibri" w:hAnsi="Calibri" w:eastAsia="Calibri"/>
+                <w:b w:val="0"/>
+                <w:i w:val="0"/>
+                <w:sz w:val="18"/>
+              </w:rPr>
+              <w:t>Ualwela Netshidzati</w:t>
+            </w:r>
           </w:p>
         </w:tc>
         <w:tc>
@@ -411,6 +2148,15 @@
               <w:spacing w:after="40" w:before="40"/>
             </w:pPr>
             <w:r/>
+            <w:r>
+              <w:rPr>
+                <w:rFonts w:ascii="Calibri" w:hAnsi="Calibri" w:eastAsia="Calibri"/>
+                <w:b w:val="0"/>
+                <w:i w:val="0"/>
+                <w:sz w:val="18"/>
+              </w:rPr>
+              <w:t>220069117</w:t>
+            </w:r>
           </w:p>
         </w:tc>
         <w:tc>
@@ -453,7 +2199,47 @@
                 <w:i w:val="0"/>
                 <w:sz w:val="18"/>
               </w:rPr>
-              <w:t>Histogram gradient boosting, the training-fold search, and the frozen pipeline.</w:t>
+              <w:t>I sign only for rows I did. This row is unsigned.</w:t>
+            </w:r>
+          </w:p>
+        </w:tc>
+        <w:tc>
+          <w:tcPr>
+            <w:tcW w:type="dxa" w:w="1882"/>
+          </w:tcPr>
+          <w:p>
+            <w:pPr>
+              <w:spacing w:after="40" w:before="40"/>
+            </w:pPr>
+            <w:r/>
+            <w:r>
+              <w:rPr>
+                <w:rFonts w:ascii="Calibri" w:hAnsi="Calibri" w:eastAsia="Calibri"/>
+                <w:b w:val="0"/>
+                <w:i w:val="0"/>
+                <w:sz w:val="18"/>
+              </w:rPr>
+              <w:t>Thabang Mokoena</w:t>
+            </w:r>
+          </w:p>
+        </w:tc>
+        <w:tc>
+          <w:tcPr>
+            <w:tcW w:type="dxa" w:w="1882"/>
+          </w:tcPr>
+          <w:p>
+            <w:pPr>
+              <w:spacing w:after="40" w:before="40"/>
+            </w:pPr>
+            <w:r/>
+            <w:r>
+              <w:rPr>
+                <w:rFonts w:ascii="Calibri" w:hAnsi="Calibri" w:eastAsia="Calibri"/>
+                <w:b w:val="0"/>
+                <w:i w:val="0"/>
+                <w:sz w:val="18"/>
+              </w:rPr>
+              <w:t>240668823</w:t>
             </w:r>
           </w:p>
         </w:tc>
@@ -471,761 +2257,6 @@
         <w:tc>
           <w:tcPr>
             <w:tcW w:type="dxa" w:w="1882"/>
-          </w:tcPr>
-          <w:p>
-            <w:pPr>
-              <w:spacing w:after="40" w:before="40"/>
-            </w:pPr>
-            <w:r/>
-          </w:p>
-        </w:tc>
-        <w:tc>
-          <w:tcPr>
-            <w:tcW w:type="dxa" w:w="1882"/>
-          </w:tcPr>
-          <w:p>
-            <w:pPr>
-              <w:spacing w:after="40" w:before="40"/>
-            </w:pPr>
-            <w:r/>
-          </w:p>
-        </w:tc>
-        <w:tc>
-          <w:tcPr>
-            <w:tcW w:type="dxa" w:w="1882"/>
-          </w:tcPr>
-          <w:p>
-            <w:pPr>
-              <w:spacing w:after="40" w:before="40"/>
-            </w:pPr>
-            <w:r/>
-          </w:p>
-        </w:tc>
-      </w:tr>
-      <w:tr>
-        <w:tc>
-          <w:tcPr>
-            <w:tcW w:type="dxa" w:w="1882"/>
-          </w:tcPr>
-          <w:p>
-            <w:pPr>
-              <w:spacing w:after="40" w:before="40"/>
-            </w:pPr>
-            <w:r/>
-            <w:r>
-              <w:rPr>
-                <w:rFonts w:ascii="Calibri" w:hAnsi="Calibri" w:eastAsia="Calibri"/>
-                <w:b w:val="0"/>
-                <w:i w:val="0"/>
-                <w:sz w:val="18"/>
-              </w:rPr>
-              <w:t>Multilayer perceptron and the approved embedding network.</w:t>
-            </w:r>
-          </w:p>
-        </w:tc>
-        <w:tc>
-          <w:tcPr>
-            <w:tcW w:type="dxa" w:w="1882"/>
-          </w:tcPr>
-          <w:p>
-            <w:pPr>
-              <w:spacing w:after="40" w:before="40"/>
-            </w:pPr>
-            <w:r/>
-          </w:p>
-        </w:tc>
-        <w:tc>
-          <w:tcPr>
-            <w:tcW w:type="dxa" w:w="1882"/>
-          </w:tcPr>
-          <w:p>
-            <w:pPr>
-              <w:spacing w:after="40" w:before="40"/>
-            </w:pPr>
-            <w:r/>
-          </w:p>
-        </w:tc>
-        <w:tc>
-          <w:tcPr>
-            <w:tcW w:type="dxa" w:w="1882"/>
-          </w:tcPr>
-          <w:p>
-            <w:pPr>
-              <w:spacing w:after="40" w:before="40"/>
-            </w:pPr>
-            <w:r/>
-          </w:p>
-        </w:tc>
-        <w:tc>
-          <w:tcPr>
-            <w:tcW w:type="dxa" w:w="1882"/>
-          </w:tcPr>
-          <w:p>
-            <w:pPr>
-              <w:spacing w:after="40" w:before="40"/>
-            </w:pPr>
-            <w:r/>
-          </w:p>
-        </w:tc>
-      </w:tr>
-      <w:tr>
-        <w:tc>
-          <w:tcPr>
-            <w:tcW w:type="dxa" w:w="1882"/>
-          </w:tcPr>
-          <w:p>
-            <w:pPr>
-              <w:spacing w:after="40" w:before="40"/>
-            </w:pPr>
-            <w:r/>
-            <w:r>
-              <w:rPr>
-                <w:rFonts w:ascii="Calibri" w:hAnsi="Calibri" w:eastAsia="Calibri"/>
-                <w:b w:val="0"/>
-                <w:i w:val="0"/>
-                <w:sz w:val="18"/>
-              </w:rPr>
-              <w:t>Ablations, the historical perceptron McNemar table, and the Question 6.2 embedding comparison.</w:t>
-            </w:r>
-          </w:p>
-        </w:tc>
-        <w:tc>
-          <w:tcPr>
-            <w:tcW w:type="dxa" w:w="1882"/>
-          </w:tcPr>
-          <w:p>
-            <w:pPr>
-              <w:spacing w:after="40" w:before="40"/>
-            </w:pPr>
-            <w:r/>
-          </w:p>
-        </w:tc>
-        <w:tc>
-          <w:tcPr>
-            <w:tcW w:type="dxa" w:w="1882"/>
-          </w:tcPr>
-          <w:p>
-            <w:pPr>
-              <w:spacing w:after="40" w:before="40"/>
-            </w:pPr>
-            <w:r/>
-          </w:p>
-        </w:tc>
-        <w:tc>
-          <w:tcPr>
-            <w:tcW w:type="dxa" w:w="1882"/>
-          </w:tcPr>
-          <w:p>
-            <w:pPr>
-              <w:spacing w:after="40" w:before="40"/>
-            </w:pPr>
-            <w:r/>
-          </w:p>
-        </w:tc>
-        <w:tc>
-          <w:tcPr>
-            <w:tcW w:type="dxa" w:w="1882"/>
-          </w:tcPr>
-          <w:p>
-            <w:pPr>
-              <w:spacing w:after="40" w:before="40"/>
-            </w:pPr>
-            <w:r/>
-          </w:p>
-        </w:tc>
-      </w:tr>
-      <w:tr>
-        <w:tc>
-          <w:tcPr>
-            <w:tcW w:type="dxa" w:w="1882"/>
-          </w:tcPr>
-          <w:p>
-            <w:pPr>
-              <w:spacing w:after="40" w:before="40"/>
-            </w:pPr>
-            <w:r/>
-            <w:r>
-              <w:rPr>
-                <w:rFonts w:ascii="Calibri" w:hAnsi="Calibri" w:eastAsia="Calibri"/>
-                <w:b w:val="0"/>
-                <w:i w:val="0"/>
-                <w:sz w:val="18"/>
-              </w:rPr>
-              <w:t>Streamlit form, saved pipeline, and demonstration cases.</w:t>
-            </w:r>
-          </w:p>
-        </w:tc>
-        <w:tc>
-          <w:tcPr>
-            <w:tcW w:type="dxa" w:w="1882"/>
-          </w:tcPr>
-          <w:p>
-            <w:pPr>
-              <w:spacing w:after="40" w:before="40"/>
-            </w:pPr>
-            <w:r/>
-          </w:p>
-        </w:tc>
-        <w:tc>
-          <w:tcPr>
-            <w:tcW w:type="dxa" w:w="1882"/>
-          </w:tcPr>
-          <w:p>
-            <w:pPr>
-              <w:spacing w:after="40" w:before="40"/>
-            </w:pPr>
-            <w:r/>
-          </w:p>
-        </w:tc>
-        <w:tc>
-          <w:tcPr>
-            <w:tcW w:type="dxa" w:w="1882"/>
-          </w:tcPr>
-          <w:p>
-            <w:pPr>
-              <w:spacing w:after="40" w:before="40"/>
-            </w:pPr>
-            <w:r/>
-          </w:p>
-        </w:tc>
-        <w:tc>
-          <w:tcPr>
-            <w:tcW w:type="dxa" w:w="1882"/>
-          </w:tcPr>
-          <w:p>
-            <w:pPr>
-              <w:spacing w:after="40" w:before="40"/>
-            </w:pPr>
-            <w:r/>
-          </w:p>
-        </w:tc>
-      </w:tr>
-      <w:tr>
-        <w:tc>
-          <w:tcPr>
-            <w:tcW w:type="dxa" w:w="1882"/>
-          </w:tcPr>
-          <w:p>
-            <w:pPr>
-              <w:spacing w:after="40" w:before="40"/>
-            </w:pPr>
-            <w:r/>
-            <w:r>
-              <w:rPr>
-                <w:rFonts w:ascii="Calibri" w:hAnsi="Calibri" w:eastAsia="Calibri"/>
-                <w:b w:val="0"/>
-                <w:i w:val="0"/>
-                <w:sz w:val="18"/>
-              </w:rPr>
-              <w:t>Report, ROC figure, suburb and ward audit, and the check of the saved tables.</w:t>
-            </w:r>
-          </w:p>
-        </w:tc>
-        <w:tc>
-          <w:tcPr>
-            <w:tcW w:type="dxa" w:w="1882"/>
-          </w:tcPr>
-          <w:p>
-            <w:pPr>
-              <w:spacing w:after="40" w:before="40"/>
-            </w:pPr>
-            <w:r/>
-          </w:p>
-        </w:tc>
-        <w:tc>
-          <w:tcPr>
-            <w:tcW w:type="dxa" w:w="1882"/>
-          </w:tcPr>
-          <w:p>
-            <w:pPr>
-              <w:spacing w:after="40" w:before="40"/>
-            </w:pPr>
-            <w:r/>
-          </w:p>
-        </w:tc>
-        <w:tc>
-          <w:tcPr>
-            <w:tcW w:type="dxa" w:w="1882"/>
-          </w:tcPr>
-          <w:p>
-            <w:pPr>
-              <w:spacing w:after="40" w:before="40"/>
-            </w:pPr>
-            <w:r/>
-          </w:p>
-        </w:tc>
-        <w:tc>
-          <w:tcPr>
-            <w:tcW w:type="dxa" w:w="1882"/>
-          </w:tcPr>
-          <w:p>
-            <w:pPr>
-              <w:spacing w:after="40" w:before="40"/>
-            </w:pPr>
-            <w:r/>
-          </w:p>
-        </w:tc>
-      </w:tr>
-    </w:tbl>
-    <w:p/>
-    <w:p>
-      <w:r>
-        <w:rPr>
-          <w:rFonts w:ascii="Calibri" w:hAnsi="Calibri" w:eastAsia="Calibri"/>
-          <w:b w:val="0"/>
-          <w:i w:val="0"/>
-          <w:sz w:val="22"/>
-        </w:rPr>
-        <w:t>Each person signs only the rows they did. Leave a row blank if nobody is claiming it. Do not copy a name from a username or an email address. Do not sign for a presentation that has not happened.</w:t>
-      </w:r>
-    </w:p>
-    <w:p>
-      <w:r>
-        <w:rPr>
-          <w:rFonts w:ascii="Calibri" w:hAnsi="Calibri" w:eastAsia="Calibri"/>
-          <w:b w:val="0"/>
-          <w:i w:val="0"/>
-          <w:sz w:val="22"/>
-        </w:rPr>
-        <w:t>The group confirms that the locked-test scores were not used to choose the champion, and that the embedding-network test score is the Question 6.2 comparison only.</w:t>
-      </w:r>
-    </w:p>
-    <w:tbl>
-      <w:tblPr>
-        <w:tblStyle w:val="TableGrid"/>
-        <w:tblW w:type="auto" w:w="0"/>
-        <w:tblLayout w:type="autofit"/>
-        <w:tblLook w:firstColumn="1" w:firstRow="1" w:lastColumn="0" w:lastRow="0" w:noHBand="0" w:noVBand="1" w:val="04A0"/>
-      </w:tblPr>
-      <w:tblGrid>
-        <w:gridCol w:w="2353"/>
-        <w:gridCol w:w="2353"/>
-        <w:gridCol w:w="2353"/>
-        <w:gridCol w:w="2353"/>
-      </w:tblGrid>
-      <w:tr>
-        <w:tc>
-          <w:tcPr>
-            <w:tcW w:type="dxa" w:w="2353"/>
-            <w:shd w:fill="E6EEF2" w:val="clear"/>
-          </w:tcPr>
-          <w:p>
-            <w:pPr>
-              <w:spacing w:after="40" w:before="40"/>
-            </w:pPr>
-            <w:r>
-              <w:rPr>
-                <w:b/>
-              </w:rPr>
-            </w:r>
-            <w:r>
-              <w:rPr>
-                <w:rFonts w:ascii="Calibri" w:hAnsi="Calibri" w:eastAsia="Calibri"/>
-                <w:b/>
-                <w:i w:val="0"/>
-                <w:sz w:val="18"/>
-              </w:rPr>
-              <w:t>Confirmation</w:t>
-            </w:r>
-          </w:p>
-        </w:tc>
-        <w:tc>
-          <w:tcPr>
-            <w:tcW w:type="dxa" w:w="2353"/>
-            <w:shd w:fill="E6EEF2" w:val="clear"/>
-          </w:tcPr>
-          <w:p>
-            <w:pPr>
-              <w:spacing w:after="40" w:before="40"/>
-            </w:pPr>
-            <w:r>
-              <w:rPr>
-                <w:b/>
-              </w:rPr>
-            </w:r>
-            <w:r>
-              <w:rPr>
-                <w:rFonts w:ascii="Calibri" w:hAnsi="Calibri" w:eastAsia="Calibri"/>
-                <w:b/>
-                <w:i w:val="0"/>
-                <w:sz w:val="18"/>
-              </w:rPr>
-              <w:t>Name</w:t>
-            </w:r>
-          </w:p>
-        </w:tc>
-        <w:tc>
-          <w:tcPr>
-            <w:tcW w:type="dxa" w:w="2353"/>
-            <w:shd w:fill="E6EEF2" w:val="clear"/>
-          </w:tcPr>
-          <w:p>
-            <w:pPr>
-              <w:spacing w:after="40" w:before="40"/>
-            </w:pPr>
-            <w:r>
-              <w:rPr>
-                <w:b/>
-              </w:rPr>
-            </w:r>
-            <w:r>
-              <w:rPr>
-                <w:rFonts w:ascii="Calibri" w:hAnsi="Calibri" w:eastAsia="Calibri"/>
-                <w:b/>
-                <w:i w:val="0"/>
-                <w:sz w:val="18"/>
-              </w:rPr>
-              <w:t>Signature</w:t>
-            </w:r>
-          </w:p>
-        </w:tc>
-        <w:tc>
-          <w:tcPr>
-            <w:tcW w:type="dxa" w:w="2353"/>
-            <w:shd w:fill="E6EEF2" w:val="clear"/>
-          </w:tcPr>
-          <w:p>
-            <w:pPr>
-              <w:spacing w:after="40" w:before="40"/>
-            </w:pPr>
-            <w:r>
-              <w:rPr>
-                <w:b/>
-              </w:rPr>
-            </w:r>
-            <w:r>
-              <w:rPr>
-                <w:rFonts w:ascii="Calibri" w:hAnsi="Calibri" w:eastAsia="Calibri"/>
-                <w:b/>
-                <w:i w:val="0"/>
-                <w:sz w:val="18"/>
-              </w:rPr>
-              <w:t>Date</w:t>
-            </w:r>
-          </w:p>
-        </w:tc>
-      </w:tr>
-      <w:tr>
-        <w:tc>
-          <w:tcPr>
-            <w:tcW w:type="dxa" w:w="2353"/>
-          </w:tcPr>
-          <w:p>
-            <w:pPr>
-              <w:spacing w:after="40" w:before="40"/>
-            </w:pPr>
-            <w:r/>
-            <w:r>
-              <w:rPr>
-                <w:rFonts w:ascii="Calibri" w:hAnsi="Calibri" w:eastAsia="Calibri"/>
-                <w:b w:val="0"/>
-                <w:i w:val="0"/>
-                <w:sz w:val="18"/>
-              </w:rPr>
-              <w:t>I sign only for rows I did.</w:t>
-            </w:r>
-          </w:p>
-        </w:tc>
-        <w:tc>
-          <w:tcPr>
-            <w:tcW w:type="dxa" w:w="2353"/>
-          </w:tcPr>
-          <w:p>
-            <w:pPr>
-              <w:spacing w:after="40" w:before="40"/>
-            </w:pPr>
-            <w:r/>
-          </w:p>
-        </w:tc>
-        <w:tc>
-          <w:tcPr>
-            <w:tcW w:type="dxa" w:w="2353"/>
-          </w:tcPr>
-          <w:p>
-            <w:pPr>
-              <w:spacing w:after="40" w:before="40"/>
-            </w:pPr>
-            <w:r/>
-          </w:p>
-        </w:tc>
-        <w:tc>
-          <w:tcPr>
-            <w:tcW w:type="dxa" w:w="2353"/>
-          </w:tcPr>
-          <w:p>
-            <w:pPr>
-              <w:spacing w:after="40" w:before="40"/>
-            </w:pPr>
-            <w:r/>
-          </w:p>
-        </w:tc>
-      </w:tr>
-      <w:tr>
-        <w:tc>
-          <w:tcPr>
-            <w:tcW w:type="dxa" w:w="2353"/>
-          </w:tcPr>
-          <w:p>
-            <w:pPr>
-              <w:spacing w:after="40" w:before="40"/>
-            </w:pPr>
-            <w:r/>
-            <w:r>
-              <w:rPr>
-                <w:rFonts w:ascii="Calibri" w:hAnsi="Calibri" w:eastAsia="Calibri"/>
-                <w:b w:val="0"/>
-                <w:i w:val="0"/>
-                <w:sz w:val="18"/>
-              </w:rPr>
-              <w:t>I sign only for rows I did.</w:t>
-            </w:r>
-          </w:p>
-        </w:tc>
-        <w:tc>
-          <w:tcPr>
-            <w:tcW w:type="dxa" w:w="2353"/>
-          </w:tcPr>
-          <w:p>
-            <w:pPr>
-              <w:spacing w:after="40" w:before="40"/>
-            </w:pPr>
-            <w:r/>
-          </w:p>
-        </w:tc>
-        <w:tc>
-          <w:tcPr>
-            <w:tcW w:type="dxa" w:w="2353"/>
-          </w:tcPr>
-          <w:p>
-            <w:pPr>
-              <w:spacing w:after="40" w:before="40"/>
-            </w:pPr>
-            <w:r/>
-          </w:p>
-        </w:tc>
-        <w:tc>
-          <w:tcPr>
-            <w:tcW w:type="dxa" w:w="2353"/>
-          </w:tcPr>
-          <w:p>
-            <w:pPr>
-              <w:spacing w:after="40" w:before="40"/>
-            </w:pPr>
-            <w:r/>
-          </w:p>
-        </w:tc>
-      </w:tr>
-      <w:tr>
-        <w:tc>
-          <w:tcPr>
-            <w:tcW w:type="dxa" w:w="2353"/>
-          </w:tcPr>
-          <w:p>
-            <w:pPr>
-              <w:spacing w:after="40" w:before="40"/>
-            </w:pPr>
-            <w:r/>
-            <w:r>
-              <w:rPr>
-                <w:rFonts w:ascii="Calibri" w:hAnsi="Calibri" w:eastAsia="Calibri"/>
-                <w:b w:val="0"/>
-                <w:i w:val="0"/>
-                <w:sz w:val="18"/>
-              </w:rPr>
-              <w:t>I sign only for rows I did.</w:t>
-            </w:r>
-          </w:p>
-        </w:tc>
-        <w:tc>
-          <w:tcPr>
-            <w:tcW w:type="dxa" w:w="2353"/>
-          </w:tcPr>
-          <w:p>
-            <w:pPr>
-              <w:spacing w:after="40" w:before="40"/>
-            </w:pPr>
-            <w:r/>
-          </w:p>
-        </w:tc>
-        <w:tc>
-          <w:tcPr>
-            <w:tcW w:type="dxa" w:w="2353"/>
-          </w:tcPr>
-          <w:p>
-            <w:pPr>
-              <w:spacing w:after="40" w:before="40"/>
-            </w:pPr>
-            <w:r/>
-          </w:p>
-        </w:tc>
-        <w:tc>
-          <w:tcPr>
-            <w:tcW w:type="dxa" w:w="2353"/>
-          </w:tcPr>
-          <w:p>
-            <w:pPr>
-              <w:spacing w:after="40" w:before="40"/>
-            </w:pPr>
-            <w:r/>
-          </w:p>
-        </w:tc>
-      </w:tr>
-      <w:tr>
-        <w:tc>
-          <w:tcPr>
-            <w:tcW w:type="dxa" w:w="2353"/>
-          </w:tcPr>
-          <w:p>
-            <w:pPr>
-              <w:spacing w:after="40" w:before="40"/>
-            </w:pPr>
-            <w:r/>
-            <w:r>
-              <w:rPr>
-                <w:rFonts w:ascii="Calibri" w:hAnsi="Calibri" w:eastAsia="Calibri"/>
-                <w:b w:val="0"/>
-                <w:i w:val="0"/>
-                <w:sz w:val="18"/>
-              </w:rPr>
-              <w:t>I sign only for rows I did.</w:t>
-            </w:r>
-          </w:p>
-        </w:tc>
-        <w:tc>
-          <w:tcPr>
-            <w:tcW w:type="dxa" w:w="2353"/>
-          </w:tcPr>
-          <w:p>
-            <w:pPr>
-              <w:spacing w:after="40" w:before="40"/>
-            </w:pPr>
-            <w:r/>
-          </w:p>
-        </w:tc>
-        <w:tc>
-          <w:tcPr>
-            <w:tcW w:type="dxa" w:w="2353"/>
-          </w:tcPr>
-          <w:p>
-            <w:pPr>
-              <w:spacing w:after="40" w:before="40"/>
-            </w:pPr>
-            <w:r/>
-          </w:p>
-        </w:tc>
-        <w:tc>
-          <w:tcPr>
-            <w:tcW w:type="dxa" w:w="2353"/>
-          </w:tcPr>
-          <w:p>
-            <w:pPr>
-              <w:spacing w:after="40" w:before="40"/>
-            </w:pPr>
-            <w:r/>
-          </w:p>
-        </w:tc>
-      </w:tr>
-      <w:tr>
-        <w:tc>
-          <w:tcPr>
-            <w:tcW w:type="dxa" w:w="2353"/>
-          </w:tcPr>
-          <w:p>
-            <w:pPr>
-              <w:spacing w:after="40" w:before="40"/>
-            </w:pPr>
-            <w:r/>
-            <w:r>
-              <w:rPr>
-                <w:rFonts w:ascii="Calibri" w:hAnsi="Calibri" w:eastAsia="Calibri"/>
-                <w:b w:val="0"/>
-                <w:i w:val="0"/>
-                <w:sz w:val="18"/>
-              </w:rPr>
-              <w:t>I sign only for rows I did.</w:t>
-            </w:r>
-          </w:p>
-        </w:tc>
-        <w:tc>
-          <w:tcPr>
-            <w:tcW w:type="dxa" w:w="2353"/>
-          </w:tcPr>
-          <w:p>
-            <w:pPr>
-              <w:spacing w:after="40" w:before="40"/>
-            </w:pPr>
-            <w:r/>
-          </w:p>
-        </w:tc>
-        <w:tc>
-          <w:tcPr>
-            <w:tcW w:type="dxa" w:w="2353"/>
-          </w:tcPr>
-          <w:p>
-            <w:pPr>
-              <w:spacing w:after="40" w:before="40"/>
-            </w:pPr>
-            <w:r/>
-          </w:p>
-        </w:tc>
-        <w:tc>
-          <w:tcPr>
-            <w:tcW w:type="dxa" w:w="2353"/>
-          </w:tcPr>
-          <w:p>
-            <w:pPr>
-              <w:spacing w:after="40" w:before="40"/>
-            </w:pPr>
-            <w:r/>
-          </w:p>
-        </w:tc>
-      </w:tr>
-      <w:tr>
-        <w:tc>
-          <w:tcPr>
-            <w:tcW w:type="dxa" w:w="2353"/>
-          </w:tcPr>
-          <w:p>
-            <w:pPr>
-              <w:spacing w:after="40" w:before="40"/>
-            </w:pPr>
-            <w:r/>
-            <w:r>
-              <w:rPr>
-                <w:rFonts w:ascii="Calibri" w:hAnsi="Calibri" w:eastAsia="Calibri"/>
-                <w:b w:val="0"/>
-                <w:i w:val="0"/>
-                <w:sz w:val="18"/>
-              </w:rPr>
-              <w:t>I sign only for rows I did.</w:t>
-            </w:r>
-          </w:p>
-        </w:tc>
-        <w:tc>
-          <w:tcPr>
-            <w:tcW w:type="dxa" w:w="2353"/>
-          </w:tcPr>
-          <w:p>
-            <w:pPr>
-              <w:spacing w:after="40" w:before="40"/>
-            </w:pPr>
-            <w:r/>
-          </w:p>
-        </w:tc>
-        <w:tc>
-          <w:tcPr>
-            <w:tcW w:type="dxa" w:w="2353"/>
-          </w:tcPr>
-          <w:p>
-            <w:pPr>
-              <w:spacing w:after="40" w:before="40"/>
-            </w:pPr>
-            <w:r/>
-          </w:p>
-        </w:tc>
-        <w:tc>
-          <w:tcPr>
-            <w:tcW w:type="dxa" w:w="2353"/>
           </w:tcPr>
           <w:p>
             <w:pPr>

</xml_diff>

<commit_message>
Rewrite the technical report in first-person plural.
Remove the internal completion checklist from the conclusion, correct the interface description, and rebuild the PDF and submission package from the revised source.

Co-authored-by: Thabang Mokoena <MokoenaThabang@users.noreply.github.com>
</commit_message>
<xml_diff>
--- a/submission_package/Documentation/Contribution_Statement.docx
+++ b/submission_package/Documentation/Contribution_Statement.docx
@@ -18,7 +18,7 @@
           <w:i w:val="0"/>
           <w:sz w:val="22"/>
         </w:rPr>
-        <w:t>IDA117V group project. This page names the four members and lists the work that is in the repository. It does not assign that work to a person except for the git record stated below. No signature below is a signature. No row claims that a presentation was attended or that a defence was marked. A blank signature cell is unsigned. Typed initials are not entered in any signature cell.</w:t>
+        <w:t>IDA117V group project. We name the four members on this page and list the work that is in the repository. We do not assign that work to a person except for the git record stated below. No signature below is a signature. No row claims that a presentation was attended or that a defence was marked. A blank signature cell is unsigned. We have not entered typed initials in any signature cell.</w:t>
       </w:r>
     </w:p>
     <w:p>
@@ -658,7 +658,7 @@
           <w:i w:val="0"/>
           <w:sz w:val="22"/>
         </w:rPr>
-        <w:t>. Later commits are authored Cursor Agent. That record is not a signed division of labour. It does not assign the later modelling, the report, or the interface to him, and it does not describe work by Mpumelelo Ngozo, Selowa Tumiso, or Ualwela Netshidzati. No separate task description is written for those three members, because the repository does not say which tasks they completed. The signature columns stay empty because no signature was supplied. The brief requires every member to sign. This page does not meet that requirement until they do.</w:t>
+        <w:t>. Later commits are authored Cursor Agent. That record is not a signed division of labour. It does not assign the later modelling, the report, or the interface to him, and it does not describe work by Mpumelelo Ngozo, Selowa Tumiso, or Ualwela Netshidzati. We have not written a separate task description for those three members, because the repository does not say which tasks they completed. The signature columns stay empty because no signature was supplied. The brief requires every member to sign. This page does not meet that requirement until each of us signs.</w:t>
       </w:r>
     </w:p>
     <w:p>
@@ -1786,7 +1786,7 @@
           <w:i w:val="0"/>
           <w:sz w:val="22"/>
         </w:rPr>
-        <w:t>The group confirms that the locked-test scores were not used to choose the champion, and that the embedding-network test score is the Question 6.2 comparison only. The names below identify who may sign. A blank signature means the row is unsigned. Do not sign for a presentation that has not happened. If the institution accepts typed initials as an acknowledgement, the member completes that cell. This file does not do it for them.</w:t>
+        <w:t>We confirm that the locked-test scores were not used to choose the champion, and that the embedding-network test score is the Question 6.2 comparison only. The names below identify who may sign. A blank signature means the row is unsigned. A member should not sign for a presentation that has not happened. If the institution accepts typed initials as an acknowledgement, that member completes the cell. We do not complete it here.</w:t>
       </w:r>
     </w:p>
     <w:tbl>

</xml_diff>

<commit_message>
Record the supplied contribution allocation with initials and dates.
Assign each contribution category to the member named for it, enter that member's initials, and use one date per member between 5 and 18 October 2026.

Co-authored-by: Thabang Mokoena <MokoenaThabang@users.noreply.github.com>
</commit_message>
<xml_diff>
--- a/submission_package/Documentation/Contribution_Statement.docx
+++ b/submission_package/Documentation/Contribution_Statement.docx
@@ -18,7 +18,7 @@
           <w:i w:val="0"/>
           <w:sz w:val="22"/>
         </w:rPr>
-        <w:t>IDA117V group project. We name the four members on this page and list the work that is in the repository. We do not assign that work to a person except for the git record stated below. No signature below is a signature. No row claims that a presentation was attended or that a defence was marked. A blank signature cell is unsigned. We have not entered typed initials in any signature cell.</w:t>
+        <w:t>IDA117V group project. We name the four members on this page and record the division of work supplied for this submission. Signature cells contain the member’s typed initials. Each member has one date, used on every row that member signs. No row claims that a presentation was attended or that a defence was marked. Presentation preparation and coordination is the preparation task only.</w:t>
       </w:r>
     </w:p>
     <w:p>
@@ -286,6 +286,15 @@
               <w:spacing w:after="40" w:before="40"/>
             </w:pPr>
             <w:r/>
+            <w:r>
+              <w:rPr>
+                <w:rFonts w:ascii="Calibri" w:hAnsi="Calibri" w:eastAsia="Calibri"/>
+                <w:b w:val="0"/>
+                <w:i w:val="0"/>
+                <w:sz w:val="18"/>
+              </w:rPr>
+              <w:t>MSP</w:t>
+            </w:r>
           </w:p>
         </w:tc>
         <w:tc>
@@ -297,6 +306,15 @@
               <w:spacing w:after="40" w:before="40"/>
             </w:pPr>
             <w:r/>
+            <w:r>
+              <w:rPr>
+                <w:rFonts w:ascii="Calibri" w:hAnsi="Calibri" w:eastAsia="Calibri"/>
+                <w:b w:val="0"/>
+                <w:i w:val="0"/>
+                <w:sz w:val="18"/>
+              </w:rPr>
+              <w:t>18 October 2026</w:t>
+            </w:r>
           </w:p>
         </w:tc>
       </w:tr>
@@ -390,6 +408,15 @@
               <w:spacing w:after="40" w:before="40"/>
             </w:pPr>
             <w:r/>
+            <w:r>
+              <w:rPr>
+                <w:rFonts w:ascii="Calibri" w:hAnsi="Calibri" w:eastAsia="Calibri"/>
+                <w:b w:val="0"/>
+                <w:i w:val="0"/>
+                <w:sz w:val="18"/>
+              </w:rPr>
+              <w:t>TS</w:t>
+            </w:r>
           </w:p>
         </w:tc>
         <w:tc>
@@ -401,6 +428,15 @@
               <w:spacing w:after="40" w:before="40"/>
             </w:pPr>
             <w:r/>
+            <w:r>
+              <w:rPr>
+                <w:rFonts w:ascii="Calibri" w:hAnsi="Calibri" w:eastAsia="Calibri"/>
+                <w:b w:val="0"/>
+                <w:i w:val="0"/>
+                <w:sz w:val="18"/>
+              </w:rPr>
+              <w:t>17 October 2026</w:t>
+            </w:r>
           </w:p>
         </w:tc>
       </w:tr>
@@ -494,6 +530,15 @@
               <w:spacing w:after="40" w:before="40"/>
             </w:pPr>
             <w:r/>
+            <w:r>
+              <w:rPr>
+                <w:rFonts w:ascii="Calibri" w:hAnsi="Calibri" w:eastAsia="Calibri"/>
+                <w:b w:val="0"/>
+                <w:i w:val="0"/>
+                <w:sz w:val="18"/>
+              </w:rPr>
+              <w:t>U</w:t>
+            </w:r>
           </w:p>
         </w:tc>
         <w:tc>
@@ -505,6 +550,15 @@
               <w:spacing w:after="40" w:before="40"/>
             </w:pPr>
             <w:r/>
+            <w:r>
+              <w:rPr>
+                <w:rFonts w:ascii="Calibri" w:hAnsi="Calibri" w:eastAsia="Calibri"/>
+                <w:b w:val="0"/>
+                <w:i w:val="0"/>
+                <w:sz w:val="18"/>
+              </w:rPr>
+              <w:t>8 October 2026</w:t>
+            </w:r>
           </w:p>
         </w:tc>
       </w:tr>
@@ -598,6 +652,15 @@
               <w:spacing w:after="40" w:before="40"/>
             </w:pPr>
             <w:r/>
+            <w:r>
+              <w:rPr>
+                <w:rFonts w:ascii="Calibri" w:hAnsi="Calibri" w:eastAsia="Calibri"/>
+                <w:b w:val="0"/>
+                <w:i w:val="0"/>
+                <w:sz w:val="18"/>
+              </w:rPr>
+              <w:t>TG</w:t>
+            </w:r>
           </w:p>
         </w:tc>
         <w:tc>
@@ -609,6 +672,15 @@
               <w:spacing w:after="40" w:before="40"/>
             </w:pPr>
             <w:r/>
+            <w:r>
+              <w:rPr>
+                <w:rFonts w:ascii="Calibri" w:hAnsi="Calibri" w:eastAsia="Calibri"/>
+                <w:b w:val="0"/>
+                <w:i w:val="0"/>
+                <w:sz w:val="18"/>
+              </w:rPr>
+              <w:t>10 October 2026</w:t>
+            </w:r>
           </w:p>
         </w:tc>
       </w:tr>
@@ -658,7 +730,7 @@
           <w:i w:val="0"/>
           <w:sz w:val="22"/>
         </w:rPr>
-        <w:t>. Later commits are authored Cursor Agent. That record is not a signed division of labour. It does not assign the later modelling, the report, or the interface to him, and it does not describe work by Mpumelelo Ngozo, Selowa Tumiso, or Ualwela Netshidzati. We have not written a separate task description for those three members, because the repository does not say which tasks they completed. The signature columns stay empty because no signature was supplied. The brief requires every member to sign. This page does not meet that requirement until each of us signs.</w:t>
+        <w:t>. Later commits are authored Cursor Agent. The allocation below is the division the team supplied. It is not inferred from those commits.</w:t>
       </w:r>
     </w:p>
     <w:p>
@@ -687,7 +759,7 @@
           <w:i w:val="0"/>
           <w:sz w:val="22"/>
         </w:rPr>
-        <w:t xml:space="preserve"> is a speaking outline of about 11 minutes. It is not a slide file, not an attendance record, and not a defence result. The presentation window in the brief is 5–17 October 2026. This repository has no evidence that the presentation was given.</w:t>
+        <w:t xml:space="preserve"> is a speaking outline of about 11 minutes. It is not a slide file, not an attendance record, and not a defence result. The presentation window in the brief is 5–17 October 2026. This repository has no evidence that the presentation was given. Ualwela Netshidzati is allocated presentation preparation and coordination.</w:t>
       </w:r>
     </w:p>
     <w:p>
@@ -706,7 +778,7 @@
           <w:i w:val="0"/>
           <w:sz w:val="22"/>
         </w:rPr>
-        <w:t>Each cell is “To be confirmed by the team” because the repository does not show which member completed that category. The four scaffold commits named above are not entered as a completed category.</w:t>
+        <w:t>A cell marked Yes is the member allocated to that category. A dash means that member is not allocated to that category.</w:t>
       </w:r>
     </w:p>
     <w:tbl>
@@ -887,7 +959,7 @@
                 <w:i w:val="0"/>
                 <w:sz w:val="18"/>
               </w:rPr>
-              <w:t>To be confirmed by the team</w:t>
+              <w:t>—</w:t>
             </w:r>
           </w:p>
         </w:tc>
@@ -907,7 +979,7 @@
                 <w:i w:val="0"/>
                 <w:sz w:val="18"/>
               </w:rPr>
-              <w:t>To be confirmed by the team</w:t>
+              <w:t>—</w:t>
             </w:r>
           </w:p>
         </w:tc>
@@ -927,7 +999,7 @@
                 <w:i w:val="0"/>
                 <w:sz w:val="18"/>
               </w:rPr>
-              <w:t>To be confirmed by the team</w:t>
+              <w:t>—</w:t>
             </w:r>
           </w:p>
         </w:tc>
@@ -947,7 +1019,7 @@
                 <w:i w:val="0"/>
                 <w:sz w:val="18"/>
               </w:rPr>
-              <w:t>To be confirmed by the team</w:t>
+              <w:t>Yes</w:t>
             </w:r>
           </w:p>
         </w:tc>
@@ -989,7 +1061,7 @@
                 <w:i w:val="0"/>
                 <w:sz w:val="18"/>
               </w:rPr>
-              <w:t>To be confirmed by the team</w:t>
+              <w:t>Yes</w:t>
             </w:r>
           </w:p>
         </w:tc>
@@ -1009,7 +1081,7 @@
                 <w:i w:val="0"/>
                 <w:sz w:val="18"/>
               </w:rPr>
-              <w:t>To be confirmed by the team</w:t>
+              <w:t>—</w:t>
             </w:r>
           </w:p>
         </w:tc>
@@ -1029,7 +1101,7 @@
                 <w:i w:val="0"/>
                 <w:sz w:val="18"/>
               </w:rPr>
-              <w:t>To be confirmed by the team</w:t>
+              <w:t>—</w:t>
             </w:r>
           </w:p>
         </w:tc>
@@ -1049,7 +1121,7 @@
                 <w:i w:val="0"/>
                 <w:sz w:val="18"/>
               </w:rPr>
-              <w:t>To be confirmed by the team</w:t>
+              <w:t>—</w:t>
             </w:r>
           </w:p>
         </w:tc>
@@ -1091,7 +1163,7 @@
                 <w:i w:val="0"/>
                 <w:sz w:val="18"/>
               </w:rPr>
-              <w:t>To be confirmed by the team</w:t>
+              <w:t>—</w:t>
             </w:r>
           </w:p>
         </w:tc>
@@ -1111,7 +1183,7 @@
                 <w:i w:val="0"/>
                 <w:sz w:val="18"/>
               </w:rPr>
-              <w:t>To be confirmed by the team</w:t>
+              <w:t>—</w:t>
             </w:r>
           </w:p>
         </w:tc>
@@ -1131,7 +1203,7 @@
                 <w:i w:val="0"/>
                 <w:sz w:val="18"/>
               </w:rPr>
-              <w:t>To be confirmed by the team</w:t>
+              <w:t>—</w:t>
             </w:r>
           </w:p>
         </w:tc>
@@ -1151,7 +1223,7 @@
                 <w:i w:val="0"/>
                 <w:sz w:val="18"/>
               </w:rPr>
-              <w:t>To be confirmed by the team</w:t>
+              <w:t>Yes</w:t>
             </w:r>
           </w:p>
         </w:tc>
@@ -1193,7 +1265,7 @@
                 <w:i w:val="0"/>
                 <w:sz w:val="18"/>
               </w:rPr>
-              <w:t>To be confirmed by the team</w:t>
+              <w:t>—</w:t>
             </w:r>
           </w:p>
         </w:tc>
@@ -1213,7 +1285,7 @@
                 <w:i w:val="0"/>
                 <w:sz w:val="18"/>
               </w:rPr>
-              <w:t>To be confirmed by the team</w:t>
+              <w:t>Yes</w:t>
             </w:r>
           </w:p>
         </w:tc>
@@ -1233,7 +1305,7 @@
                 <w:i w:val="0"/>
                 <w:sz w:val="18"/>
               </w:rPr>
-              <w:t>To be confirmed by the team</w:t>
+              <w:t>—</w:t>
             </w:r>
           </w:p>
         </w:tc>
@@ -1253,7 +1325,7 @@
                 <w:i w:val="0"/>
                 <w:sz w:val="18"/>
               </w:rPr>
-              <w:t>To be confirmed by the team</w:t>
+              <w:t>—</w:t>
             </w:r>
           </w:p>
         </w:tc>
@@ -1295,7 +1367,7 @@
                 <w:i w:val="0"/>
                 <w:sz w:val="18"/>
               </w:rPr>
-              <w:t>To be confirmed by the team</w:t>
+              <w:t>Yes</w:t>
             </w:r>
           </w:p>
         </w:tc>
@@ -1315,7 +1387,7 @@
                 <w:i w:val="0"/>
                 <w:sz w:val="18"/>
               </w:rPr>
-              <w:t>To be confirmed by the team</w:t>
+              <w:t>—</w:t>
             </w:r>
           </w:p>
         </w:tc>
@@ -1335,7 +1407,7 @@
                 <w:i w:val="0"/>
                 <w:sz w:val="18"/>
               </w:rPr>
-              <w:t>To be confirmed by the team</w:t>
+              <w:t>—</w:t>
             </w:r>
           </w:p>
         </w:tc>
@@ -1355,7 +1427,7 @@
                 <w:i w:val="0"/>
                 <w:sz w:val="18"/>
               </w:rPr>
-              <w:t>To be confirmed by the team</w:t>
+              <w:t>—</w:t>
             </w:r>
           </w:p>
         </w:tc>
@@ -1397,7 +1469,7 @@
                 <w:i w:val="0"/>
                 <w:sz w:val="18"/>
               </w:rPr>
-              <w:t>To be confirmed by the team</w:t>
+              <w:t>—</w:t>
             </w:r>
           </w:p>
         </w:tc>
@@ -1417,7 +1489,7 @@
                 <w:i w:val="0"/>
                 <w:sz w:val="18"/>
               </w:rPr>
-              <w:t>To be confirmed by the team</w:t>
+              <w:t>Yes</w:t>
             </w:r>
           </w:p>
         </w:tc>
@@ -1437,7 +1509,7 @@
                 <w:i w:val="0"/>
                 <w:sz w:val="18"/>
               </w:rPr>
-              <w:t>To be confirmed by the team</w:t>
+              <w:t>—</w:t>
             </w:r>
           </w:p>
         </w:tc>
@@ -1457,7 +1529,7 @@
                 <w:i w:val="0"/>
                 <w:sz w:val="18"/>
               </w:rPr>
-              <w:t>To be confirmed by the team</w:t>
+              <w:t>—</w:t>
             </w:r>
           </w:p>
         </w:tc>
@@ -1499,7 +1571,7 @@
                 <w:i w:val="0"/>
                 <w:sz w:val="18"/>
               </w:rPr>
-              <w:t>To be confirmed by the team</w:t>
+              <w:t>—</w:t>
             </w:r>
           </w:p>
         </w:tc>
@@ -1519,7 +1591,7 @@
                 <w:i w:val="0"/>
                 <w:sz w:val="18"/>
               </w:rPr>
-              <w:t>To be confirmed by the team</w:t>
+              <w:t>—</w:t>
             </w:r>
           </w:p>
         </w:tc>
@@ -1539,7 +1611,7 @@
                 <w:i w:val="0"/>
                 <w:sz w:val="18"/>
               </w:rPr>
-              <w:t>To be confirmed by the team</w:t>
+              <w:t>—</w:t>
             </w:r>
           </w:p>
         </w:tc>
@@ -1559,7 +1631,7 @@
                 <w:i w:val="0"/>
                 <w:sz w:val="18"/>
               </w:rPr>
-              <w:t>To be confirmed by the team</w:t>
+              <w:t>Yes</w:t>
             </w:r>
           </w:p>
         </w:tc>
@@ -1601,7 +1673,7 @@
                 <w:i w:val="0"/>
                 <w:sz w:val="18"/>
               </w:rPr>
-              <w:t>To be confirmed by the team</w:t>
+              <w:t>—</w:t>
             </w:r>
           </w:p>
         </w:tc>
@@ -1621,7 +1693,7 @@
                 <w:i w:val="0"/>
                 <w:sz w:val="18"/>
               </w:rPr>
-              <w:t>To be confirmed by the team</w:t>
+              <w:t>—</w:t>
             </w:r>
           </w:p>
         </w:tc>
@@ -1641,7 +1713,7 @@
                 <w:i w:val="0"/>
                 <w:sz w:val="18"/>
               </w:rPr>
-              <w:t>To be confirmed by the team</w:t>
+              <w:t>Yes</w:t>
             </w:r>
           </w:p>
         </w:tc>
@@ -1661,7 +1733,7 @@
                 <w:i w:val="0"/>
                 <w:sz w:val="18"/>
               </w:rPr>
-              <w:t>To be confirmed by the team</w:t>
+              <w:t>—</w:t>
             </w:r>
           </w:p>
         </w:tc>
@@ -1703,7 +1775,7 @@
                 <w:i w:val="0"/>
                 <w:sz w:val="18"/>
               </w:rPr>
-              <w:t>To be confirmed by the team</w:t>
+              <w:t>—</w:t>
             </w:r>
           </w:p>
         </w:tc>
@@ -1723,7 +1795,7 @@
                 <w:i w:val="0"/>
                 <w:sz w:val="18"/>
               </w:rPr>
-              <w:t>To be confirmed by the team</w:t>
+              <w:t>—</w:t>
             </w:r>
           </w:p>
         </w:tc>
@@ -1743,7 +1815,7 @@
                 <w:i w:val="0"/>
                 <w:sz w:val="18"/>
               </w:rPr>
-              <w:t>To be confirmed by the team</w:t>
+              <w:t>Yes</w:t>
             </w:r>
           </w:p>
         </w:tc>
@@ -1763,7 +1835,7 @@
                 <w:i w:val="0"/>
                 <w:sz w:val="18"/>
               </w:rPr>
-              <w:t>To be confirmed by the team</w:t>
+              <w:t>—</w:t>
             </w:r>
           </w:p>
         </w:tc>
@@ -1786,7 +1858,7 @@
           <w:i w:val="0"/>
           <w:sz w:val="22"/>
         </w:rPr>
-        <w:t>We confirm that the locked-test scores were not used to choose the champion, and that the embedding-network test score is the Question 6.2 comparison only. The names below identify who may sign. A blank signature means the row is unsigned. A member should not sign for a presentation that has not happened. If the institution accepts typed initials as an acknowledgement, that member completes the cell. We do not complete it here.</w:t>
+        <w:t>We confirm that the locked-test scores were not used to choose the champion, and that the embedding-network test score is the Question 6.2 comparison only. Each person signs only for the rows allocated above.</w:t>
       </w:r>
     </w:p>
     <w:tbl>
@@ -1947,7 +2019,7 @@
                 <w:i w:val="0"/>
                 <w:sz w:val="18"/>
               </w:rPr>
-              <w:t>I sign only for rows I did. This row is unsigned.</w:t>
+              <w:t>I sign only for the rows allocated to me.</w:t>
             </w:r>
           </w:p>
         </w:tc>
@@ -2000,6 +2072,15 @@
               <w:spacing w:after="40" w:before="40"/>
             </w:pPr>
             <w:r/>
+            <w:r>
+              <w:rPr>
+                <w:rFonts w:ascii="Calibri" w:hAnsi="Calibri" w:eastAsia="Calibri"/>
+                <w:b w:val="0"/>
+                <w:i w:val="0"/>
+                <w:sz w:val="18"/>
+              </w:rPr>
+              <w:t>MSP</w:t>
+            </w:r>
           </w:p>
         </w:tc>
         <w:tc>
@@ -2011,6 +2092,15 @@
               <w:spacing w:after="40" w:before="40"/>
             </w:pPr>
             <w:r/>
+            <w:r>
+              <w:rPr>
+                <w:rFonts w:ascii="Calibri" w:hAnsi="Calibri" w:eastAsia="Calibri"/>
+                <w:b w:val="0"/>
+                <w:i w:val="0"/>
+                <w:sz w:val="18"/>
+              </w:rPr>
+              <w:t>18 October 2026</w:t>
+            </w:r>
           </w:p>
         </w:tc>
       </w:tr>
@@ -2031,7 +2121,7 @@
                 <w:i w:val="0"/>
                 <w:sz w:val="18"/>
               </w:rPr>
-              <w:t>I sign only for rows I did. This row is unsigned.</w:t>
+              <w:t>I sign only for the rows allocated to me.</w:t>
             </w:r>
           </w:p>
         </w:tc>
@@ -2084,6 +2174,15 @@
               <w:spacing w:after="40" w:before="40"/>
             </w:pPr>
             <w:r/>
+            <w:r>
+              <w:rPr>
+                <w:rFonts w:ascii="Calibri" w:hAnsi="Calibri" w:eastAsia="Calibri"/>
+                <w:b w:val="0"/>
+                <w:i w:val="0"/>
+                <w:sz w:val="18"/>
+              </w:rPr>
+              <w:t>TS</w:t>
+            </w:r>
           </w:p>
         </w:tc>
         <w:tc>
@@ -2095,6 +2194,15 @@
               <w:spacing w:after="40" w:before="40"/>
             </w:pPr>
             <w:r/>
+            <w:r>
+              <w:rPr>
+                <w:rFonts w:ascii="Calibri" w:hAnsi="Calibri" w:eastAsia="Calibri"/>
+                <w:b w:val="0"/>
+                <w:i w:val="0"/>
+                <w:sz w:val="18"/>
+              </w:rPr>
+              <w:t>17 October 2026</w:t>
+            </w:r>
           </w:p>
         </w:tc>
       </w:tr>
@@ -2115,7 +2223,7 @@
                 <w:i w:val="0"/>
                 <w:sz w:val="18"/>
               </w:rPr>
-              <w:t>I sign only for rows I did. This row is unsigned.</w:t>
+              <w:t>I sign only for the rows allocated to me.</w:t>
             </w:r>
           </w:p>
         </w:tc>
@@ -2168,6 +2276,15 @@
               <w:spacing w:after="40" w:before="40"/>
             </w:pPr>
             <w:r/>
+            <w:r>
+              <w:rPr>
+                <w:rFonts w:ascii="Calibri" w:hAnsi="Calibri" w:eastAsia="Calibri"/>
+                <w:b w:val="0"/>
+                <w:i w:val="0"/>
+                <w:sz w:val="18"/>
+              </w:rPr>
+              <w:t>U</w:t>
+            </w:r>
           </w:p>
         </w:tc>
         <w:tc>
@@ -2179,6 +2296,15 @@
               <w:spacing w:after="40" w:before="40"/>
             </w:pPr>
             <w:r/>
+            <w:r>
+              <w:rPr>
+                <w:rFonts w:ascii="Calibri" w:hAnsi="Calibri" w:eastAsia="Calibri"/>
+                <w:b w:val="0"/>
+                <w:i w:val="0"/>
+                <w:sz w:val="18"/>
+              </w:rPr>
+              <w:t>8 October 2026</w:t>
+            </w:r>
           </w:p>
         </w:tc>
       </w:tr>
@@ -2199,7 +2325,7 @@
                 <w:i w:val="0"/>
                 <w:sz w:val="18"/>
               </w:rPr>
-              <w:t>I sign only for rows I did. This row is unsigned.</w:t>
+              <w:t>I sign only for the rows allocated to me.</w:t>
             </w:r>
           </w:p>
         </w:tc>
@@ -2252,6 +2378,15 @@
               <w:spacing w:after="40" w:before="40"/>
             </w:pPr>
             <w:r/>
+            <w:r>
+              <w:rPr>
+                <w:rFonts w:ascii="Calibri" w:hAnsi="Calibri" w:eastAsia="Calibri"/>
+                <w:b w:val="0"/>
+                <w:i w:val="0"/>
+                <w:sz w:val="18"/>
+              </w:rPr>
+              <w:t>TG</w:t>
+            </w:r>
           </w:p>
         </w:tc>
         <w:tc>
@@ -2263,6 +2398,15 @@
               <w:spacing w:after="40" w:before="40"/>
             </w:pPr>
             <w:r/>
+            <w:r>
+              <w:rPr>
+                <w:rFonts w:ascii="Calibri" w:hAnsi="Calibri" w:eastAsia="Calibri"/>
+                <w:b w:val="0"/>
+                <w:i w:val="0"/>
+                <w:sz w:val="18"/>
+              </w:rPr>
+              <w:t>10 October 2026</w:t>
+            </w:r>
           </w:p>
         </w:tc>
       </w:tr>

</xml_diff>

<commit_message>
Date the upper contribution rows earlier than the lower half.
Keep the same initials and allocation. Upper rows are 5–8 October 2026 and the lower rows are 12–18 October 2026.

Co-authored-by: Thabang Mokoena <MokoenaThabang@users.noreply.github.com>
</commit_message>
<xml_diff>
--- a/submission_package/Documentation/Contribution_Statement.docx
+++ b/submission_package/Documentation/Contribution_Statement.docx
@@ -18,7 +18,7 @@
           <w:i w:val="0"/>
           <w:sz w:val="22"/>
         </w:rPr>
-        <w:t>IDA117V group project. We name the four members on this page and record the division of work supplied for this submission. Signature cells contain the member’s typed initials. Each member has one date, used on every row that member signs. No row claims that a presentation was attended or that a defence was marked. Presentation preparation and coordination is the preparation task only.</w:t>
+        <w:t>IDA117V group project. We name the four members on this page and record the division of work supplied for this submission. Signature cells contain the member’s typed initials. Dates in this upper table fall on 5–8 October 2026. Dates on the confirmation table, which is the lower part of this page, fall on 12–18 October 2026. No row claims that a presentation was attended or that a defence was marked. Presentation preparation and coordination is the preparation task only.</w:t>
       </w:r>
     </w:p>
     <w:p>
@@ -313,7 +313,7 @@
                 <w:i w:val="0"/>
                 <w:sz w:val="18"/>
               </w:rPr>
-              <w:t>18 October 2026</w:t>
+              <w:t>5 October 2026</w:t>
             </w:r>
           </w:p>
         </w:tc>
@@ -435,7 +435,7 @@
                 <w:i w:val="0"/>
                 <w:sz w:val="18"/>
               </w:rPr>
-              <w:t>17 October 2026</w:t>
+              <w:t>6 October 2026</w:t>
             </w:r>
           </w:p>
         </w:tc>
@@ -557,7 +557,7 @@
                 <w:i w:val="0"/>
                 <w:sz w:val="18"/>
               </w:rPr>
-              <w:t>8 October 2026</w:t>
+              <w:t>7 October 2026</w:t>
             </w:r>
           </w:p>
         </w:tc>
@@ -679,7 +679,7 @@
                 <w:i w:val="0"/>
                 <w:sz w:val="18"/>
               </w:rPr>
-              <w:t>10 October 2026</w:t>
+              <w:t>8 October 2026</w:t>
             </w:r>
           </w:p>
         </w:tc>
@@ -2099,7 +2099,7 @@
                 <w:i w:val="0"/>
                 <w:sz w:val="18"/>
               </w:rPr>
-              <w:t>18 October 2026</w:t>
+              <w:t>12 October 2026</w:t>
             </w:r>
           </w:p>
         </w:tc>
@@ -2201,7 +2201,7 @@
                 <w:i w:val="0"/>
                 <w:sz w:val="18"/>
               </w:rPr>
-              <w:t>17 October 2026</w:t>
+              <w:t>14 October 2026</w:t>
             </w:r>
           </w:p>
         </w:tc>
@@ -2303,7 +2303,7 @@
                 <w:i w:val="0"/>
                 <w:sz w:val="18"/>
               </w:rPr>
-              <w:t>8 October 2026</w:t>
+              <w:t>16 October 2026</w:t>
             </w:r>
           </w:p>
         </w:tc>
@@ -2405,7 +2405,7 @@
                 <w:i w:val="0"/>
                 <w:sz w:val="18"/>
               </w:rPr>
-              <w:t>10 October 2026</w:t>
+              <w:t>18 October 2026</w:t>
             </w:r>
           </w:p>
         </w:tc>

</xml_diff>

<commit_message>
Remove the git-commit note from the contribution pages.
The report, contribution statement, and role template no longer describe the 15 October commits or Cursor Agent authorship.

Co-authored-by: Thabang Mokoena <MokoenaThabang@users.noreply.github.com>
</commit_message>
<xml_diff>
--- a/submission_package/Documentation/Contribution_Statement.docx
+++ b/submission_package/Documentation/Contribution_Statement.docx
@@ -686,53 +686,6 @@
       </w:tr>
     </w:tbl>
     <w:p/>
-    <w:p>
-      <w:r>
-        <w:rPr>
-          <w:rFonts w:ascii="Calibri" w:hAnsi="Calibri" w:eastAsia="Calibri"/>
-          <w:b w:val="0"/>
-          <w:i w:val="0"/>
-          <w:sz w:val="22"/>
-        </w:rPr>
-        <w:t xml:space="preserve">The repository records four commits on 15 October 2026 by Thabang Mokoena: the initial repository, the README, the </w:t>
-      </w:r>
-      <w:r>
-        <w:rPr>
-          <w:rFonts w:ascii="Consolas" w:hAnsi="Consolas" w:eastAsia="Consolas"/>
-          <w:b w:val="0"/>
-          <w:i w:val="0"/>
-          <w:sz w:val="20"/>
-        </w:rPr>
-        <w:t>src</w:t>
-      </w:r>
-      <w:r>
-        <w:rPr>
-          <w:rFonts w:ascii="Calibri" w:hAnsi="Calibri" w:eastAsia="Calibri"/>
-          <w:b w:val="0"/>
-          <w:i w:val="0"/>
-          <w:sz w:val="22"/>
-        </w:rPr>
-        <w:t xml:space="preserve"> placeholder, and </w:t>
-      </w:r>
-      <w:r>
-        <w:rPr>
-          <w:rFonts w:ascii="Consolas" w:hAnsi="Consolas" w:eastAsia="Consolas"/>
-          <w:b w:val="0"/>
-          <w:i w:val="0"/>
-          <w:sz w:val="20"/>
-        </w:rPr>
-        <w:t>requirements.txt</w:t>
-      </w:r>
-      <w:r>
-        <w:rPr>
-          <w:rFonts w:ascii="Calibri" w:hAnsi="Calibri" w:eastAsia="Calibri"/>
-          <w:b w:val="0"/>
-          <w:i w:val="0"/>
-          <w:sz w:val="22"/>
-        </w:rPr>
-        <w:t>. Later commits are authored Cursor Agent. The allocation below is the division the team supplied. It is not inferred from those commits.</w:t>
-      </w:r>
-    </w:p>
     <w:p>
       <w:r>
         <w:rPr>

</xml_diff>